<commit_message>
Day 3 - Fixed dog and added particle system
Particle system is a bit broken...
</commit_message>
<xml_diff>
--- a/StudentFolders/A1/29kingstont/side_scroller/side scroller plan.docx
+++ b/StudentFolders/A1/29kingstont/side_scroller/side scroller plan.docx
@@ -61,19 +61,7 @@
         <w:rPr>
           <w:lang w:val="en-US"/>
         </w:rPr>
-        <w:t>A procedurally generated 2D side-scroller ‘sandbox’ with different elements like plants or animals that react to their environments. F</w:t>
-      </w:r>
-      <w:r>
-        <w:rPr>
-          <w:lang w:val="en-US"/>
-        </w:rPr>
-        <w:t>or example, plants that grow with water or creatures that run away from the player.</w:t>
-      </w:r>
-      <w:r>
-        <w:rPr>
-          <w:lang w:val="en-US"/>
-        </w:rPr>
-        <w:t xml:space="preserve"> Additionally, the player will be able to interact with the world through the cursor or other hardware inputs such as the keyboard or the microphone. Since it’s a 2D side-scroller there will be different layers on screen (foreground, </w:t>
+        <w:t xml:space="preserve">A procedurally generated 2D side-scroller ‘sandbox’ with different elements like plants or animals that react to their environments. For example, plants that grow with water or creatures that run away from the player. Additionally, the player will be able to interact with the world through the cursor or other hardware inputs such as the keyboard or the microphone. Since it’s a 2D side-scroller there will be different layers on screen (foreground, </w:t>
       </w:r>
       <w:proofErr w:type="spellStart"/>
       <w:r>
@@ -210,14 +198,7 @@
           <w:szCs w:val="16"/>
         </w:rPr>
         <w:tab/>
-        <w:t xml:space="preserve">Variables &amp; Data Types – store positions, sizes, colors, health, </w:t>
-      </w:r>
-      <w:r>
-        <w:rPr>
-          <w:sz w:val="16"/>
-          <w:szCs w:val="16"/>
-        </w:rPr>
-        <w:t>etc.</w:t>
+        <w:t>Variables &amp; Data Types – store positions, sizes, colors, health, etc.</w:t>
       </w:r>
     </w:p>
     <w:p>
@@ -1910,11 +1891,276 @@
     <w:p>
       <w:pPr>
         <w:rPr>
-          <w:i/>
-          <w:iCs/>
+          <w:b/>
+          <w:bCs/>
           <w:u w:val="single"/>
         </w:rPr>
       </w:pPr>
+      <w:r>
+        <w:rPr>
+          <w:b/>
+          <w:bCs/>
+          <w:u w:val="single"/>
+        </w:rPr>
+        <w:t>Day 2 – Nov. 6, 2025</w:t>
+      </w:r>
+    </w:p>
+    <w:p>
+      <w:r>
+        <w:t>What I worked on</w:t>
+      </w:r>
+    </w:p>
+    <w:p>
+      <w:pPr>
+        <w:pStyle w:val="ListParagraph"/>
+        <w:numPr>
+          <w:ilvl w:val="0"/>
+          <w:numId w:val="1"/>
+        </w:numPr>
+      </w:pPr>
+      <w:r>
+        <w:t>Optimizations to the rendering system</w:t>
+      </w:r>
+    </w:p>
+    <w:p>
+      <w:pPr>
+        <w:pStyle w:val="ListParagraph"/>
+        <w:numPr>
+          <w:ilvl w:val="1"/>
+          <w:numId w:val="1"/>
+        </w:numPr>
+      </w:pPr>
+      <w:r>
+        <w:t>Instead of submitting entities each frame</w:t>
+      </w:r>
+      <w:r>
+        <w:t xml:space="preserve"> and removing the next frame</w:t>
+      </w:r>
+      <w:r>
+        <w:t>, it now stores entities and removes by ID if necessary</w:t>
+      </w:r>
+    </w:p>
+    <w:p>
+      <w:pPr>
+        <w:pStyle w:val="ListParagraph"/>
+        <w:numPr>
+          <w:ilvl w:val="0"/>
+          <w:numId w:val="1"/>
+        </w:numPr>
+      </w:pPr>
+      <w:r>
+        <w:t>Edits to the Movable class (now called Entity)</w:t>
+      </w:r>
+    </w:p>
+    <w:p>
+      <w:pPr>
+        <w:pStyle w:val="ListParagraph"/>
+        <w:numPr>
+          <w:ilvl w:val="1"/>
+          <w:numId w:val="1"/>
+        </w:numPr>
+      </w:pPr>
+      <w:r>
+        <w:t>Added an incrementing ID (0 for first, 1 for second, etc.)</w:t>
+      </w:r>
+    </w:p>
+    <w:p>
+      <w:pPr>
+        <w:pStyle w:val="ListParagraph"/>
+        <w:numPr>
+          <w:ilvl w:val="0"/>
+          <w:numId w:val="1"/>
+        </w:numPr>
+      </w:pPr>
+      <w:r>
+        <w:lastRenderedPageBreak/>
+        <w:t>Added a dog</w:t>
+      </w:r>
+      <w:r>
+        <w:t xml:space="preserve"> entity as a test</w:t>
+      </w:r>
+    </w:p>
+    <w:p>
+      <w:r>
+        <w:t>Problems</w:t>
+      </w:r>
+    </w:p>
+    <w:p>
+      <w:pPr>
+        <w:pStyle w:val="ListParagraph"/>
+        <w:numPr>
+          <w:ilvl w:val="0"/>
+          <w:numId w:val="1"/>
+        </w:numPr>
+      </w:pPr>
+      <w:r>
+        <w:t>Making the dog move normally instead of orbitting the player</w:t>
+      </w:r>
+    </w:p>
+    <w:p>
+      <w:pPr>
+        <w:pStyle w:val="ListParagraph"/>
+        <w:numPr>
+          <w:ilvl w:val="1"/>
+          <w:numId w:val="1"/>
+        </w:numPr>
+      </w:pPr>
+      <w:r>
+        <w:t>(I didn’t have enough time to fix it)</w:t>
+      </w:r>
+    </w:p>
+    <w:p>
+      <w:r>
+        <w:t>Next class</w:t>
+      </w:r>
+    </w:p>
+    <w:p>
+      <w:pPr>
+        <w:pStyle w:val="ListParagraph"/>
+        <w:numPr>
+          <w:ilvl w:val="0"/>
+          <w:numId w:val="1"/>
+        </w:numPr>
+      </w:pPr>
+      <w:r>
+        <w:t xml:space="preserve">Work on the dog: make it </w:t>
+      </w:r>
+      <w:r>
+        <w:rPr>
+          <w:u w:val="single"/>
+        </w:rPr>
+        <w:t>not</w:t>
+      </w:r>
+      <w:r>
+        <w:t xml:space="preserve"> orbit the player</w:t>
+      </w:r>
+    </w:p>
+    <w:p>
+      <w:pPr>
+        <w:pStyle w:val="ListParagraph"/>
+        <w:numPr>
+          <w:ilvl w:val="1"/>
+          <w:numId w:val="1"/>
+        </w:numPr>
+      </w:pPr>
+      <w:r>
+        <w:t>Instead make it follow the player once the player leaves a 100 pixel radius</w:t>
+      </w:r>
+    </w:p>
+    <w:p>
+      <w:pPr>
+        <w:rPr>
+          <w:b/>
+          <w:bCs/>
+          <w:u w:val="single"/>
+        </w:rPr>
+      </w:pPr>
+      <w:r>
+        <w:rPr>
+          <w:b/>
+          <w:bCs/>
+          <w:u w:val="single"/>
+        </w:rPr>
+        <w:t xml:space="preserve">Day </w:t>
+      </w:r>
+      <w:r>
+        <w:rPr>
+          <w:b/>
+          <w:bCs/>
+          <w:u w:val="single"/>
+        </w:rPr>
+        <w:t>3</w:t>
+      </w:r>
+      <w:r>
+        <w:rPr>
+          <w:b/>
+          <w:bCs/>
+          <w:u w:val="single"/>
+        </w:rPr>
+        <w:t xml:space="preserve"> – Nov. </w:t>
+      </w:r>
+      <w:r>
+        <w:rPr>
+          <w:b/>
+          <w:bCs/>
+          <w:u w:val="single"/>
+        </w:rPr>
+        <w:t>10</w:t>
+      </w:r>
+      <w:r>
+        <w:rPr>
+          <w:b/>
+          <w:bCs/>
+          <w:u w:val="single"/>
+        </w:rPr>
+        <w:t>, 2025</w:t>
+      </w:r>
+    </w:p>
+    <w:p>
+      <w:r>
+        <w:t>What I worked on</w:t>
+      </w:r>
+    </w:p>
+    <w:p>
+      <w:pPr>
+        <w:pStyle w:val="ListParagraph"/>
+        <w:numPr>
+          <w:ilvl w:val="0"/>
+          <w:numId w:val="1"/>
+        </w:numPr>
+      </w:pPr>
+      <w:r>
+        <w:t>Fixed the dog. It’s now a flying dog that doesn’t sink into the floor</w:t>
+      </w:r>
+    </w:p>
+    <w:p>
+      <w:pPr>
+        <w:pStyle w:val="ListParagraph"/>
+        <w:numPr>
+          <w:ilvl w:val="0"/>
+          <w:numId w:val="1"/>
+        </w:numPr>
+      </w:pPr>
+      <w:r>
+        <w:t>Added a Particle and Particle System class for future use</w:t>
+      </w:r>
+    </w:p>
+    <w:p>
+      <w:r>
+        <w:t>Problems</w:t>
+      </w:r>
+    </w:p>
+    <w:p>
+      <w:pPr>
+        <w:pStyle w:val="ListParagraph"/>
+        <w:numPr>
+          <w:ilvl w:val="1"/>
+          <w:numId w:val="1"/>
+        </w:numPr>
+      </w:pPr>
+      <w:r>
+        <w:t>The particle system doesn’t seem to attach to entities properly</w:t>
+      </w:r>
+    </w:p>
+    <w:p>
+      <w:r>
+        <w:t>Next class</w:t>
+      </w:r>
+    </w:p>
+    <w:p>
+      <w:pPr>
+        <w:pStyle w:val="ListParagraph"/>
+        <w:numPr>
+          <w:ilvl w:val="0"/>
+          <w:numId w:val="1"/>
+        </w:numPr>
+      </w:pPr>
+      <w:r>
+        <w:t xml:space="preserve">Work on the </w:t>
+      </w:r>
+      <w:r>
+        <w:t>particle system</w:t>
+      </w:r>
     </w:p>
     <w:sectPr>
       <w:pgSz w:w="12240" w:h="15840"/>

</xml_diff>

<commit_message>
Refactor physics and entity system; add platforms
Introduces Body, CircleBody, and RectBody classes to handle physics and collision logic. Refactors Entity to use a Body for position, velocity, and mass, and updates Meeple and FlyingDog to use new body types.

Adds Platform class :) and basic platform collision (only from top). Updates display and movement logic to use new physics abstractions. Removes cached rendering (which actually slowed things down) from Static and related classes, and simplifies Bush and Tree rendering.
</commit_message>
<xml_diff>
--- a/StudentFolders/A1/29kingstont/side_scroller/side scroller plan.docx
+++ b/StudentFolders/A1/29kingstont/side_scroller/side scroller plan.docx
@@ -2061,39 +2061,269 @@
           <w:bCs/>
           <w:u w:val="single"/>
         </w:rPr>
-        <w:t xml:space="preserve">Day </w:t>
-      </w:r>
-      <w:r>
+        <w:t>Day 3 – Nov. 10, 2025</w:t>
+      </w:r>
+    </w:p>
+    <w:p>
+      <w:r>
+        <w:t>What I worked on</w:t>
+      </w:r>
+    </w:p>
+    <w:p>
+      <w:pPr>
+        <w:pStyle w:val="ListParagraph"/>
+        <w:numPr>
+          <w:ilvl w:val="0"/>
+          <w:numId w:val="1"/>
+        </w:numPr>
+      </w:pPr>
+      <w:r>
+        <w:t>Fixed the dog. It’s now a flying dog that doesn’t sink into the floor</w:t>
+      </w:r>
+    </w:p>
+    <w:p>
+      <w:pPr>
+        <w:pStyle w:val="ListParagraph"/>
+        <w:numPr>
+          <w:ilvl w:val="0"/>
+          <w:numId w:val="1"/>
+        </w:numPr>
+      </w:pPr>
+      <w:r>
+        <w:t>Added a Particle and Particle System class for future use</w:t>
+      </w:r>
+    </w:p>
+    <w:p>
+      <w:r>
+        <w:t>Problems</w:t>
+      </w:r>
+    </w:p>
+    <w:p>
+      <w:pPr>
+        <w:pStyle w:val="ListParagraph"/>
+        <w:numPr>
+          <w:ilvl w:val="0"/>
+          <w:numId w:val="1"/>
+        </w:numPr>
+      </w:pPr>
+      <w:r>
+        <w:t xml:space="preserve">  </w:t>
+      </w:r>
+      <w:r>
+        <w:t>The particle system doesn’t seem to attach to entities properly</w:t>
+      </w:r>
+    </w:p>
+    <w:p>
+      <w:r>
+        <w:t>Next class</w:t>
+      </w:r>
+    </w:p>
+    <w:p>
+      <w:pPr>
+        <w:pStyle w:val="ListParagraph"/>
+        <w:numPr>
+          <w:ilvl w:val="0"/>
+          <w:numId w:val="1"/>
+        </w:numPr>
+      </w:pPr>
+      <w:r>
+        <w:t>Work on the particle system</w:t>
+      </w:r>
+    </w:p>
+    <w:p>
+      <w:pPr>
         <w:rPr>
           <w:b/>
           <w:bCs/>
           <w:u w:val="single"/>
         </w:rPr>
-        <w:t>3</w:t>
-      </w:r>
+      </w:pPr>
       <w:r>
         <w:rPr>
           <w:b/>
           <w:bCs/>
           <w:u w:val="single"/>
         </w:rPr>
-        <w:t xml:space="preserve"> – Nov. </w:t>
-      </w:r>
-      <w:r>
+        <w:t>Day 4 – Nov. 12, 2025</w:t>
+      </w:r>
+    </w:p>
+    <w:p>
+      <w:pPr>
         <w:rPr>
           <w:b/>
           <w:bCs/>
           <w:u w:val="single"/>
         </w:rPr>
-        <w:t>10</w:t>
-      </w:r>
-      <w:r>
+      </w:pPr>
+      <w:r>
+        <w:rPr>
+          <w:b/>
+          <w:bCs/>
+          <w:noProof/>
+          <w:u w:val="single"/>
+        </w:rPr>
+        <w:drawing>
+          <wp:inline distT="0" distB="0" distL="0" distR="0" wp14:anchorId="10150074" wp14:editId="3236231F">
+            <wp:extent cx="3998563" cy="2286785"/>
+            <wp:effectExtent l="0" t="0" r="2540" b="0"/>
+            <wp:docPr id="898426409" name="Picture 1" descr="A screenshot of a video game&#10;&#10;AI-generated content may be incorrect."/>
+            <wp:cNvGraphicFramePr>
+              <a:graphicFrameLocks xmlns:a="http://schemas.openxmlformats.org/drawingml/2006/main" noChangeAspect="1"/>
+            </wp:cNvGraphicFramePr>
+            <a:graphic xmlns:a="http://schemas.openxmlformats.org/drawingml/2006/main">
+              <a:graphicData uri="http://schemas.openxmlformats.org/drawingml/2006/picture">
+                <pic:pic xmlns:pic="http://schemas.openxmlformats.org/drawingml/2006/picture">
+                  <pic:nvPicPr>
+                    <pic:cNvPr id="898426409" name="Picture 1" descr="A screenshot of a video game&#10;&#10;AI-generated content may be incorrect."/>
+                    <pic:cNvPicPr/>
+                  </pic:nvPicPr>
+                  <pic:blipFill>
+                    <a:blip r:embed="rId5"/>
+                    <a:stretch>
+                      <a:fillRect/>
+                    </a:stretch>
+                  </pic:blipFill>
+                  <pic:spPr>
+                    <a:xfrm>
+                      <a:off x="0" y="0"/>
+                      <a:ext cx="4020797" cy="2299501"/>
+                    </a:xfrm>
+                    <a:prstGeom prst="rect">
+                      <a:avLst/>
+                    </a:prstGeom>
+                  </pic:spPr>
+                </pic:pic>
+              </a:graphicData>
+            </a:graphic>
+          </wp:inline>
+        </w:drawing>
+      </w:r>
+    </w:p>
+    <w:p>
+      <w:r>
+        <w:t>What I worked on</w:t>
+      </w:r>
+    </w:p>
+    <w:p>
+      <w:pPr>
+        <w:pStyle w:val="ListParagraph"/>
+        <w:numPr>
+          <w:ilvl w:val="0"/>
+          <w:numId w:val="1"/>
+        </w:numPr>
+      </w:pPr>
+      <w:r>
+        <w:t>Added a dirt particles that move when you’re on the floor</w:t>
+      </w:r>
+    </w:p>
+    <w:p>
+      <w:pPr>
+        <w:pStyle w:val="ListParagraph"/>
+        <w:numPr>
+          <w:ilvl w:val="0"/>
+          <w:numId w:val="1"/>
+        </w:numPr>
+      </w:pPr>
+      <w:r>
+        <w:t>More optimizations to the program</w:t>
+      </w:r>
+    </w:p>
+    <w:p>
+      <w:r>
+        <w:lastRenderedPageBreak/>
+        <w:t>Problems</w:t>
+      </w:r>
+    </w:p>
+    <w:p>
+      <w:pPr>
+        <w:pStyle w:val="ListParagraph"/>
+        <w:numPr>
+          <w:ilvl w:val="0"/>
+          <w:numId w:val="1"/>
+        </w:numPr>
+      </w:pPr>
+      <w:r>
+        <w:t>None</w:t>
+      </w:r>
+    </w:p>
+    <w:p>
+      <w:r>
+        <w:t>Next class</w:t>
+      </w:r>
+    </w:p>
+    <w:p>
+      <w:pPr>
+        <w:pStyle w:val="ListParagraph"/>
+        <w:numPr>
+          <w:ilvl w:val="0"/>
+          <w:numId w:val="1"/>
+        </w:numPr>
+      </w:pPr>
+      <w:r>
+        <w:t>Allowing flying on dogs</w:t>
+      </w:r>
+    </w:p>
+    <w:p>
+      <w:pPr>
+        <w:pStyle w:val="ListParagraph"/>
+        <w:numPr>
+          <w:ilvl w:val="0"/>
+          <w:numId w:val="1"/>
+        </w:numPr>
+      </w:pPr>
+      <w:r>
+        <w:t>Make the game do all sorts of crazy things</w:t>
+      </w:r>
+    </w:p>
+    <w:p>
+      <w:pPr>
+        <w:pStyle w:val="ListParagraph"/>
+        <w:numPr>
+          <w:ilvl w:val="1"/>
+          <w:numId w:val="1"/>
+        </w:numPr>
+      </w:pPr>
+      <w:r>
+        <w:t xml:space="preserve">Sandbox where anything is possible </w:t>
+      </w:r>
+      <w:r>
+        <w:rPr>
+          <w:rFonts w:hint="eastAsia"/>
+        </w:rPr>
+        <w:sym w:font="Wingdings" w:char="F04A"/>
+      </w:r>
+    </w:p>
+    <w:p>
+      <w:pPr>
+        <w:pStyle w:val="ListParagraph"/>
+        <w:numPr>
+          <w:ilvl w:val="1"/>
+          <w:numId w:val="1"/>
+        </w:numPr>
+      </w:pPr>
+      <w:r>
+        <w:t>Crazy stuff t</w:t>
+      </w:r>
+      <w:r>
+        <w:t>oo</w:t>
+      </w:r>
+    </w:p>
+    <w:p/>
+    <w:p>
+      <w:pPr>
         <w:rPr>
           <w:b/>
           <w:bCs/>
           <w:u w:val="single"/>
         </w:rPr>
-        <w:t>, 2025</w:t>
+      </w:pPr>
+      <w:r>
+        <w:rPr>
+          <w:b/>
+          <w:bCs/>
+          <w:u w:val="single"/>
+        </w:rPr>
+        <w:t>Day 5 – Nov. 14, 2025</w:t>
       </w:r>
     </w:p>
     <w:p>
@@ -2110,7 +2340,12 @@
         </w:numPr>
       </w:pPr>
       <w:r>
-        <w:t>Fixed the dog. It’s now a flying dog that doesn’t sink into the floor</w:t>
+        <w:t>Scaffolding for the attach feature</w:t>
+      </w:r>
+    </w:p>
+    <w:p>
+      <w:r>
+        <w:t>Problems</w:t>
       </w:r>
     </w:p>
     <w:p>
@@ -2122,7 +2357,194 @@
         </w:numPr>
       </w:pPr>
       <w:r>
-        <w:t>Added a Particle and Particle System class for future use</w:t>
+        <w:t>SEVERE LAG ISSUES- Body seems to be lagging the entire game to a ridiculous extent</w:t>
+      </w:r>
+    </w:p>
+    <w:p>
+      <w:r>
+        <w:t>Next class</w:t>
+      </w:r>
+    </w:p>
+    <w:p>
+      <w:pPr>
+        <w:pStyle w:val="ListParagraph"/>
+        <w:numPr>
+          <w:ilvl w:val="0"/>
+          <w:numId w:val="1"/>
+        </w:numPr>
+      </w:pPr>
+      <w:r>
+        <w:t>Fix the lag issues</w:t>
+      </w:r>
+    </w:p>
+    <w:p>
+      <w:pPr>
+        <w:pStyle w:val="ListParagraph"/>
+        <w:numPr>
+          <w:ilvl w:val="0"/>
+          <w:numId w:val="1"/>
+        </w:numPr>
+      </w:pPr>
+      <w:r>
+        <w:t>Attach featur</w:t>
+      </w:r>
+      <w:r>
+        <w:t>e</w:t>
+      </w:r>
+    </w:p>
+    <w:p>
+      <w:pPr>
+        <w:pStyle w:val="ListParagraph"/>
+        <w:numPr>
+          <w:ilvl w:val="0"/>
+          <w:numId w:val="1"/>
+        </w:numPr>
+      </w:pPr>
+      <w:r>
+        <w:t>Platforms</w:t>
+      </w:r>
+      <w:r>
+        <w:t xml:space="preserve"> (mario-style)</w:t>
+      </w:r>
+    </w:p>
+    <w:p/>
+    <w:p>
+      <w:pPr>
+        <w:rPr>
+          <w:b/>
+          <w:bCs/>
+          <w:u w:val="single"/>
+        </w:rPr>
+      </w:pPr>
+      <w:r>
+        <w:rPr>
+          <w:b/>
+          <w:bCs/>
+          <w:u w:val="single"/>
+        </w:rPr>
+        <w:t>Day 6</w:t>
+      </w:r>
+    </w:p>
+    <w:p>
+      <w:pPr>
+        <w:rPr>
+          <w:b/>
+          <w:bCs/>
+          <w:u w:val="single"/>
+        </w:rPr>
+      </w:pPr>
+      <w:r>
+        <w:rPr>
+          <w:b/>
+          <w:bCs/>
+          <w:noProof/>
+          <w:u w:val="single"/>
+        </w:rPr>
+        <w:lastRenderedPageBreak/>
+        <w:drawing>
+          <wp:inline distT="0" distB="0" distL="0" distR="0" wp14:anchorId="09B6F30B" wp14:editId="3FFCF2EE">
+            <wp:extent cx="5943600" cy="3388995"/>
+            <wp:effectExtent l="0" t="0" r="0" b="1905"/>
+            <wp:docPr id="1297855821" name="Picture 1" descr="A video game screen with a red ball and green bushes&#10;&#10;AI-generated content may be incorrect."/>
+            <wp:cNvGraphicFramePr>
+              <a:graphicFrameLocks xmlns:a="http://schemas.openxmlformats.org/drawingml/2006/main" noChangeAspect="1"/>
+            </wp:cNvGraphicFramePr>
+            <a:graphic xmlns:a="http://schemas.openxmlformats.org/drawingml/2006/main">
+              <a:graphicData uri="http://schemas.openxmlformats.org/drawingml/2006/picture">
+                <pic:pic xmlns:pic="http://schemas.openxmlformats.org/drawingml/2006/picture">
+                  <pic:nvPicPr>
+                    <pic:cNvPr id="1297855821" name="Picture 1" descr="A video game screen with a red ball and green bushes&#10;&#10;AI-generated content may be incorrect."/>
+                    <pic:cNvPicPr/>
+                  </pic:nvPicPr>
+                  <pic:blipFill>
+                    <a:blip r:embed="rId6" cstate="print">
+                      <a:extLst>
+                        <a:ext uri="{28A0092B-C50C-407E-A947-70E740481C1C}">
+                          <a14:useLocalDpi xmlns:a14="http://schemas.microsoft.com/office/drawing/2010/main" val="0"/>
+                        </a:ext>
+                      </a:extLst>
+                    </a:blip>
+                    <a:stretch>
+                      <a:fillRect/>
+                    </a:stretch>
+                  </pic:blipFill>
+                  <pic:spPr>
+                    <a:xfrm>
+                      <a:off x="0" y="0"/>
+                      <a:ext cx="5943600" cy="3388995"/>
+                    </a:xfrm>
+                    <a:prstGeom prst="rect">
+                      <a:avLst/>
+                    </a:prstGeom>
+                  </pic:spPr>
+                </pic:pic>
+              </a:graphicData>
+            </a:graphic>
+          </wp:inline>
+        </w:drawing>
+      </w:r>
+    </w:p>
+    <w:p>
+      <w:r>
+        <w:t>What I worked on</w:t>
+      </w:r>
+    </w:p>
+    <w:p>
+      <w:pPr>
+        <w:pStyle w:val="ListParagraph"/>
+        <w:numPr>
+          <w:ilvl w:val="0"/>
+          <w:numId w:val="1"/>
+        </w:numPr>
+      </w:pPr>
+      <w:r>
+        <w:t>Added delta time: now, the sandbox should run at the same visually seem to run at the same speed regardless of the frame rate</w:t>
+      </w:r>
+    </w:p>
+    <w:p>
+      <w:pPr>
+        <w:pStyle w:val="ListParagraph"/>
+        <w:numPr>
+          <w:ilvl w:val="0"/>
+          <w:numId w:val="1"/>
+        </w:numPr>
+      </w:pPr>
+      <w:r>
+        <w:t>Added platforms</w:t>
+      </w:r>
+    </w:p>
+    <w:p>
+      <w:pPr>
+        <w:pStyle w:val="ListParagraph"/>
+        <w:numPr>
+          <w:ilvl w:val="0"/>
+          <w:numId w:val="1"/>
+        </w:numPr>
+      </w:pPr>
+      <w:r>
+        <w:t>Fixed lag issues</w:t>
+      </w:r>
+    </w:p>
+    <w:p>
+      <w:pPr>
+        <w:pStyle w:val="ListParagraph"/>
+        <w:numPr>
+          <w:ilvl w:val="0"/>
+          <w:numId w:val="1"/>
+        </w:numPr>
+      </w:pPr>
+      <w:r>
+        <w:t xml:space="preserve">Fixed bug where circle collisions didn’t work (I used the radius instead of diameter when calling </w:t>
+      </w:r>
+      <w:r>
+        <w:rPr>
+          <w:i/>
+          <w:iCs/>
+        </w:rPr>
+        <w:t>circle()</w:t>
+      </w:r>
+      <w:r>
+        <w:t>)</w:t>
       </w:r>
     </w:p>
     <w:p>
@@ -2134,12 +2556,12 @@
       <w:pPr>
         <w:pStyle w:val="ListParagraph"/>
         <w:numPr>
-          <w:ilvl w:val="1"/>
-          <w:numId w:val="1"/>
-        </w:numPr>
-      </w:pPr>
-      <w:r>
-        <w:t>The particle system doesn’t seem to attach to entities properly</w:t>
+          <w:ilvl w:val="0"/>
+          <w:numId w:val="1"/>
+        </w:numPr>
+      </w:pPr>
+      <w:r>
+        <w:t>Platform collision (not only top collisions but also side-on collisions)</w:t>
       </w:r>
     </w:p>
     <w:p>
@@ -2156,13 +2578,28 @@
         </w:numPr>
       </w:pPr>
       <w:r>
-        <w:t xml:space="preserve">Work on the </w:t>
-      </w:r>
-      <w:r>
-        <w:t>particle system</w:t>
-      </w:r>
+        <w:t>Fix platforms (mario style)</w:t>
+      </w:r>
+    </w:p>
+    <w:p>
+      <w:pPr>
+        <w:pStyle w:val="ListParagraph"/>
+        <w:numPr>
+          <w:ilvl w:val="0"/>
+          <w:numId w:val="1"/>
+        </w:numPr>
+      </w:pPr>
+      <w:r>
+        <w:t>Platform generation feature</w:t>
+      </w:r>
+    </w:p>
+    <w:p>
+      <w:pPr>
+        <w:ind w:left="360"/>
+      </w:pPr>
     </w:p>
     <w:sectPr>
+      <w:type w:val="evenPage"/>
       <w:pgSz w:w="12240" w:h="15840"/>
       <w:pgMar w:top="1440" w:right="1440" w:bottom="1440" w:left="1440" w:header="708" w:footer="708" w:gutter="0"/>
       <w:cols w:space="708"/>
@@ -2693,6 +3130,7 @@
   <w:style w:type="paragraph" w:default="1" w:styleId="Normal">
     <w:name w:val="Normal"/>
     <w:qFormat/>
+    <w:rsid w:val="00E832A7"/>
   </w:style>
   <w:style w:type="paragraph" w:styleId="Heading1">
     <w:name w:val="heading 1"/>
@@ -3526,4 +3964,39 @@
     </a:ext>
   </a:extLst>
 </a:theme>
+</file>
+
+<file path=word/webextensions/taskpanes.xml><?xml version="1.0" encoding="utf-8"?>
+<wetp:taskpanes xmlns:wetp="http://schemas.microsoft.com/office/webextensions/taskpanes/2010/11">
+  <wetp:taskpane dockstate="right" visibility="0" width="350" row="0">
+    <wetp:webextensionref xmlns:r="http://schemas.openxmlformats.org/officeDocument/2006/relationships" r:id="rId1"/>
+  </wetp:taskpane>
+  <wetp:taskpane dockstate="right" visibility="0" width="350" row="0">
+    <wetp:webextensionref xmlns:r="http://schemas.openxmlformats.org/officeDocument/2006/relationships" r:id="rId2"/>
+  </wetp:taskpane>
+</wetp:taskpanes>
+</file>
+
+<file path=word/webextensions/webextension1.xml><?xml version="1.0" encoding="utf-8"?>
+<we:webextension xmlns:we="http://schemas.microsoft.com/office/webextensions/webextension/2010/11" id="{0DB96E7F-8AC6-6B40-914F-E767161E0218}">
+  <we:reference id="4b785c87-866c-4bad-85d8-5d1ae467ac9a" version="3.19.0.0" store="EXCatalog" storeType="EXCatalog"/>
+  <we:alternateReferences>
+    <we:reference id="WA104381909" version="3.19.0.0" store="en-US" storeType="OMEX"/>
+  </we:alternateReferences>
+  <we:properties/>
+  <we:bindings/>
+  <we:snapshot xmlns:r="http://schemas.openxmlformats.org/officeDocument/2006/relationships"/>
+</we:webextension>
+</file>
+
+<file path=word/webextensions/webextension2.xml><?xml version="1.0" encoding="utf-8"?>
+<we:webextension xmlns:we="http://schemas.microsoft.com/office/webextensions/webextension/2010/11" id="{E75909EF-2FF4-D541-B018-97C30BF5CCAF}">
+  <we:reference id="281a62fe-b32b-4552-a64d-9f2953e8d02d" version="1.0.0.0" store="EXCatalog" storeType="EXCatalog"/>
+  <we:alternateReferences>
+    <we:reference id="WA104380480" version="1.0.0.0" store="en-US" storeType="OMEX"/>
+  </we:alternateReferences>
+  <we:properties/>
+  <we:bindings/>
+  <we:snapshot xmlns:r="http://schemas.openxmlformats.org/officeDocument/2006/relationships"/>
+</we:webextension>
 </file>
</xml_diff>

<commit_message>
update to plan doc
</commit_message>
<xml_diff>
--- a/StudentFolders/A1/29kingstont/side_scroller/side scroller plan.docx
+++ b/StudentFolders/A1/29kingstont/side_scroller/side scroller plan.docx
@@ -61,21 +61,7 @@
         <w:rPr>
           <w:lang w:val="en-US"/>
         </w:rPr>
-        <w:t xml:space="preserve">A procedurally generated 2D side-scroller ‘sandbox’ with different elements like plants or animals that react to their environments. For example, plants that grow with water or creatures that run away from the player. Additionally, the player will be able to interact with the world through the cursor or other hardware inputs such as the keyboard or the microphone. Since it’s a 2D side-scroller there will be different layers on screen (foreground, </w:t>
-      </w:r>
-      <w:proofErr w:type="spellStart"/>
-      <w:r>
-        <w:rPr>
-          <w:lang w:val="en-US"/>
-        </w:rPr>
-        <w:t>middleground</w:t>
-      </w:r>
-      <w:proofErr w:type="spellEnd"/>
-      <w:r>
-        <w:rPr>
-          <w:lang w:val="en-US"/>
-        </w:rPr>
-        <w:t>, background) with darker shading as it nears the background to create an illusion perception of depth.</w:t>
+        <w:t>A procedurally generated 2D side-scroller ‘sandbox’ with different elements like plants or animals that react to their environments. For example, plants that grow with water or creatures that run away from the player. Additionally, the player will be able to interact with the world through the cursor or other hardware inputs such as the keyboard or the microphone. Since it’s a 2D side-scroller there will be different layers on screen (foreground, middleground, background) with darker shading as it nears the background to create an illusion perception of depth.</w:t>
       </w:r>
     </w:p>
     <w:p>
@@ -2545,6 +2531,18 @@
       </w:r>
       <w:r>
         <w:t>)</w:t>
+      </w:r>
+    </w:p>
+    <w:p>
+      <w:pPr>
+        <w:pStyle w:val="ListParagraph"/>
+        <w:numPr>
+          <w:ilvl w:val="0"/>
+          <w:numId w:val="1"/>
+        </w:numPr>
+      </w:pPr>
+      <w:r>
+        <w:t>Removed ‘cached rendering’ (not really cached, but whatever) from bushes and trees which actually slowed down the program (drawing to a separate Pimage took longer than expected, leading to lag issues as each bush took 1ms to draw, way too long for the number of bushes on screen at a time.</w:t>
       </w:r>
     </w:p>
     <w:p>

</xml_diff>

<commit_message>
Add enemy, collision, and health systems
Introduces Enemy and Roofus classes, a collision detection system, and health management for entities. Refactors Body and Entity classes to support new features, updates platform and body collision logic, and improves display methods. Adds support for enemies in World, increases gravity and movement speed, and enhances Meeple rendering.
</commit_message>
<xml_diff>
--- a/StudentFolders/A1/29kingstont/side_scroller/side scroller plan.docx
+++ b/StudentFolders/A1/29kingstont/side_scroller/side scroller plan.docx
@@ -2593,8 +2593,138 @@
     </w:p>
     <w:p>
       <w:pPr>
-        <w:ind w:left="360"/>
-      </w:pPr>
+        <w:rPr>
+          <w:b/>
+          <w:bCs/>
+          <w:u w:val="single"/>
+        </w:rPr>
+      </w:pPr>
+    </w:p>
+    <w:p>
+      <w:pPr>
+        <w:rPr>
+          <w:b/>
+          <w:bCs/>
+          <w:u w:val="single"/>
+        </w:rPr>
+      </w:pPr>
+    </w:p>
+    <w:p>
+      <w:pPr>
+        <w:rPr>
+          <w:b/>
+          <w:bCs/>
+          <w:u w:val="single"/>
+        </w:rPr>
+      </w:pPr>
+      <w:r>
+        <w:rPr>
+          <w:b/>
+          <w:bCs/>
+          <w:u w:val="single"/>
+        </w:rPr>
+        <w:lastRenderedPageBreak/>
+        <w:t>Day 7 – Nov. 20, 2025</w:t>
+      </w:r>
+    </w:p>
+    <w:p>
+      <w:r>
+        <w:t>What I worked on</w:t>
+      </w:r>
+    </w:p>
+    <w:p>
+      <w:pPr>
+        <w:pStyle w:val="ListParagraph"/>
+        <w:numPr>
+          <w:ilvl w:val="0"/>
+          <w:numId w:val="1"/>
+        </w:numPr>
+      </w:pPr>
+      <w:r>
+        <w:t>Made platforms work</w:t>
+      </w:r>
+    </w:p>
+    <w:p>
+      <w:pPr>
+        <w:pStyle w:val="ListParagraph"/>
+        <w:numPr>
+          <w:ilvl w:val="1"/>
+          <w:numId w:val="1"/>
+        </w:numPr>
+      </w:pPr>
+      <w:r>
+        <w:t>They’re one-way, meaning you can phase thru them but if you jump on them, you’ll remain on top</w:t>
+      </w:r>
+    </w:p>
+    <w:p>
+      <w:pPr>
+        <w:pStyle w:val="ListParagraph"/>
+        <w:numPr>
+          <w:ilvl w:val="1"/>
+          <w:numId w:val="1"/>
+        </w:numPr>
+      </w:pPr>
+      <w:r>
+        <w:t>Basically mario style</w:t>
+      </w:r>
+    </w:p>
+    <w:p>
+      <w:pPr>
+        <w:pStyle w:val="ListParagraph"/>
+        <w:numPr>
+          <w:ilvl w:val="0"/>
+          <w:numId w:val="1"/>
+        </w:numPr>
+      </w:pPr>
+      <w:r>
+        <w:t>Created basic enemy scaffolding</w:t>
+      </w:r>
+    </w:p>
+    <w:p>
+      <w:pPr>
+        <w:pStyle w:val="ListParagraph"/>
+        <w:numPr>
+          <w:ilvl w:val="1"/>
+          <w:numId w:val="1"/>
+        </w:numPr>
+      </w:pPr>
+      <w:r>
+        <w:t>Added an enemy called Roofus</w:t>
+      </w:r>
+    </w:p>
+    <w:p>
+      <w:r>
+        <w:t>Problems</w:t>
+      </w:r>
+    </w:p>
+    <w:p>
+      <w:pPr>
+        <w:pStyle w:val="ListParagraph"/>
+        <w:numPr>
+          <w:ilvl w:val="0"/>
+          <w:numId w:val="1"/>
+        </w:numPr>
+      </w:pPr>
+      <w:r>
+        <w:t>None</w:t>
+      </w:r>
+    </w:p>
+    <w:p>
+      <w:r>
+        <w:t>Next class</w:t>
+      </w:r>
+    </w:p>
+    <w:p>
+      <w:pPr>
+        <w:pStyle w:val="ListParagraph"/>
+        <w:numPr>
+          <w:ilvl w:val="0"/>
+          <w:numId w:val="1"/>
+        </w:numPr>
+      </w:pPr>
+      <w:r>
+        <w:t>Make Roofus follow the player</w:t>
+      </w:r>
     </w:p>
     <w:sectPr>
       <w:type w:val="evenPage"/>
@@ -2610,6 +2740,94 @@
 <file path=word/numbering.xml><?xml version="1.0" encoding="utf-8"?>
 <w:numbering xmlns:wpc="http://schemas.microsoft.com/office/word/2010/wordprocessingCanvas" xmlns:cx="http://schemas.microsoft.com/office/drawing/2014/chartex" xmlns:cx1="http://schemas.microsoft.com/office/drawing/2015/9/8/chartex" xmlns:cx2="http://schemas.microsoft.com/office/drawing/2015/10/21/chartex" xmlns:cx3="http://schemas.microsoft.com/office/drawing/2016/5/9/chartex" xmlns:cx4="http://schemas.microsoft.com/office/drawing/2016/5/10/chartex" xmlns:cx5="http://schemas.microsoft.com/office/drawing/2016/5/11/chartex" xmlns:cx6="http://schemas.microsoft.com/office/drawing/2016/5/12/chartex" xmlns:cx7="http://schemas.microsoft.com/office/drawing/2016/5/13/chartex" xmlns:cx8="http://schemas.microsoft.com/office/drawing/2016/5/14/chartex" xmlns:mc="http://schemas.openxmlformats.org/markup-compatibility/2006" xmlns:aink="http://schemas.microsoft.com/office/drawing/2016/ink" xmlns:am3d="http://schemas.microsoft.com/office/drawing/2017/model3d" xmlns:o="urn:schemas-microsoft-com:office:office" xmlns:oel="http://schemas.microsoft.com/office/2019/extlst" xmlns:r="http://schemas.openxmlformats.org/officeDocument/2006/relationships" xmlns:m="http://schemas.openxmlformats.org/officeDocument/2006/math" xmlns:v="urn:schemas-microsoft-com:vml" xmlns:wp14="http://schemas.microsoft.com/office/word/2010/wordprocessingDrawing" xmlns:wp="http://schemas.openxmlformats.org/drawingml/2006/wordprocessingDrawing" xmlns:w10="urn:schemas-microsoft-com:office:word" xmlns:w="http://schemas.openxmlformats.org/wordprocessingml/2006/main" xmlns:w14="http://schemas.microsoft.com/office/word/2010/wordml" xmlns:w15="http://schemas.microsoft.com/office/word/2012/wordml" xmlns:w16cex="http://schemas.microsoft.com/office/word/2018/wordml/cex" xmlns:w16cid="http://schemas.microsoft.com/office/word/2016/wordml/cid" xmlns:w16="http://schemas.microsoft.com/office/word/2018/wordml" xmlns:w16du="http://schemas.microsoft.com/office/word/2023/wordml/word16du" xmlns:w16sdtdh="http://schemas.microsoft.com/office/word/2020/wordml/sdtdatahash" xmlns:w16sdtfl="http://schemas.microsoft.com/office/word/2024/wordml/sdtformatlock" xmlns:w16se="http://schemas.microsoft.com/office/word/2015/wordml/symex" xmlns:wpg="http://schemas.microsoft.com/office/word/2010/wordprocessingGroup" xmlns:wpi="http://schemas.microsoft.com/office/word/2010/wordprocessingInk" xmlns:wne="http://schemas.microsoft.com/office/word/2006/wordml" xmlns:wps="http://schemas.microsoft.com/office/word/2010/wordprocessingShape" mc:Ignorable="w14 w15 w16se w16cid w16 w16cex w16sdtdh w16sdtfl w16du wp14">
   <w:abstractNum w:abstractNumId="0" w15:restartNumberingAfterBreak="0">
+    <w:nsid w:val="42F87782"/>
+    <w:multiLevelType w:val="hybridMultilevel"/>
+    <w:tmpl w:val="841E07D0"/>
+    <w:lvl w:ilvl="0" w:tplc="D1788750">
+      <w:numFmt w:val="decimal"/>
+      <w:lvlText w:val="%1-"/>
+      <w:lvlJc w:val="left"/>
+      <w:pPr>
+        <w:ind w:left="720" w:hanging="360"/>
+      </w:pPr>
+      <w:rPr>
+        <w:rFonts w:hint="default"/>
+      </w:rPr>
+    </w:lvl>
+    <w:lvl w:ilvl="1" w:tplc="04090019" w:tentative="1">
+      <w:start w:val="1"/>
+      <w:numFmt w:val="lowerLetter"/>
+      <w:lvlText w:val="%2."/>
+      <w:lvlJc w:val="left"/>
+      <w:pPr>
+        <w:ind w:left="1440" w:hanging="360"/>
+      </w:pPr>
+    </w:lvl>
+    <w:lvl w:ilvl="2" w:tplc="0409001B" w:tentative="1">
+      <w:start w:val="1"/>
+      <w:numFmt w:val="lowerRoman"/>
+      <w:lvlText w:val="%3."/>
+      <w:lvlJc w:val="right"/>
+      <w:pPr>
+        <w:ind w:left="2160" w:hanging="180"/>
+      </w:pPr>
+    </w:lvl>
+    <w:lvl w:ilvl="3" w:tplc="0409000F" w:tentative="1">
+      <w:start w:val="1"/>
+      <w:numFmt w:val="decimal"/>
+      <w:lvlText w:val="%4."/>
+      <w:lvlJc w:val="left"/>
+      <w:pPr>
+        <w:ind w:left="2880" w:hanging="360"/>
+      </w:pPr>
+    </w:lvl>
+    <w:lvl w:ilvl="4" w:tplc="04090019" w:tentative="1">
+      <w:start w:val="1"/>
+      <w:numFmt w:val="lowerLetter"/>
+      <w:lvlText w:val="%5."/>
+      <w:lvlJc w:val="left"/>
+      <w:pPr>
+        <w:ind w:left="3600" w:hanging="360"/>
+      </w:pPr>
+    </w:lvl>
+    <w:lvl w:ilvl="5" w:tplc="0409001B" w:tentative="1">
+      <w:start w:val="1"/>
+      <w:numFmt w:val="lowerRoman"/>
+      <w:lvlText w:val="%6."/>
+      <w:lvlJc w:val="right"/>
+      <w:pPr>
+        <w:ind w:left="4320" w:hanging="180"/>
+      </w:pPr>
+    </w:lvl>
+    <w:lvl w:ilvl="6" w:tplc="0409000F" w:tentative="1">
+      <w:start w:val="1"/>
+      <w:numFmt w:val="decimal"/>
+      <w:lvlText w:val="%7."/>
+      <w:lvlJc w:val="left"/>
+      <w:pPr>
+        <w:ind w:left="5040" w:hanging="360"/>
+      </w:pPr>
+    </w:lvl>
+    <w:lvl w:ilvl="7" w:tplc="04090019" w:tentative="1">
+      <w:start w:val="1"/>
+      <w:numFmt w:val="lowerLetter"/>
+      <w:lvlText w:val="%8."/>
+      <w:lvlJc w:val="left"/>
+      <w:pPr>
+        <w:ind w:left="5760" w:hanging="360"/>
+      </w:pPr>
+    </w:lvl>
+    <w:lvl w:ilvl="8" w:tplc="0409001B" w:tentative="1">
+      <w:start w:val="1"/>
+      <w:numFmt w:val="lowerRoman"/>
+      <w:lvlText w:val="%9."/>
+      <w:lvlJc w:val="right"/>
+      <w:pPr>
+        <w:ind w:left="6480" w:hanging="180"/>
+      </w:pPr>
+    </w:lvl>
+  </w:abstractNum>
+  <w:abstractNum w:abstractNumId="1" w15:restartNumberingAfterBreak="0">
     <w:nsid w:val="4CFE765C"/>
     <w:multiLevelType w:val="hybridMultilevel"/>
     <w:tmpl w:val="8D823B74"/>
@@ -2723,6 +2941,9 @@
     </w:lvl>
   </w:abstractNum>
   <w:num w:numId="1" w16cid:durableId="450710361">
+    <w:abstractNumId w:val="1"/>
+  </w:num>
+  <w:num w:numId="2" w16cid:durableId="398333865">
     <w:abstractNumId w:val="0"/>
   </w:num>
 </w:numbering>

</xml_diff>

<commit_message>
Add weapons, items, and combat system
Introduced a weapon and item system, including Knife and Flag classes, and refactored Entity and Enemy classes to support health, damage, and item usage. Added Bullet and Minion classes, implemented attack logic for Meeple and enemies, and improved collision detection for circles and rectangles. Updated Layer to remove dead entities, added a health bar UI, and made various bug fixes and refactors to support the new combat mechanics.
</commit_message>
<xml_diff>
--- a/StudentFolders/A1/29kingstont/side_scroller/side scroller plan.docx
+++ b/StudentFolders/A1/29kingstont/side_scroller/side scroller plan.docx
@@ -61,7 +61,21 @@
         <w:rPr>
           <w:lang w:val="en-US"/>
         </w:rPr>
-        <w:t>A procedurally generated 2D side-scroller ‘sandbox’ with different elements like plants or animals that react to their environments. For example, plants that grow with water or creatures that run away from the player. Additionally, the player will be able to interact with the world through the cursor or other hardware inputs such as the keyboard or the microphone. Since it’s a 2D side-scroller there will be different layers on screen (foreground, middleground, background) with darker shading as it nears the background to create an illusion perception of depth.</w:t>
+        <w:t xml:space="preserve">A procedurally generated 2D side-scroller ‘sandbox’ with different elements like plants or animals that react to their environments. For example, plants that grow with water or creatures that run away from the player. Additionally, the player will be able to interact with the world through the cursor or other hardware inputs such as the keyboard or the microphone. Since it’s a 2D side-scroller there will be different layers on screen (foreground, </w:t>
+      </w:r>
+      <w:proofErr w:type="spellStart"/>
+      <w:r>
+        <w:rPr>
+          <w:lang w:val="en-US"/>
+        </w:rPr>
+        <w:t>middleground</w:t>
+      </w:r>
+      <w:proofErr w:type="spellEnd"/>
+      <w:r>
+        <w:rPr>
+          <w:lang w:val="en-US"/>
+        </w:rPr>
+        <w:t>, background) with darker shading as it nears the background to create an illusion perception of depth.</w:t>
       </w:r>
     </w:p>
     <w:p>
@@ -2726,6 +2740,301 @@
         <w:t>Make Roofus follow the player</w:t>
       </w:r>
     </w:p>
+    <w:p/>
+    <w:p>
+      <w:pPr>
+        <w:rPr>
+          <w:b/>
+          <w:bCs/>
+          <w:u w:val="single"/>
+        </w:rPr>
+      </w:pPr>
+      <w:r>
+        <w:rPr>
+          <w:b/>
+          <w:bCs/>
+          <w:u w:val="single"/>
+        </w:rPr>
+        <w:t>Day 8 – Nov. 24, 2025</w:t>
+      </w:r>
+    </w:p>
+    <w:p>
+      <w:pPr>
+        <w:rPr>
+          <w:b/>
+          <w:bCs/>
+          <w:u w:val="single"/>
+        </w:rPr>
+      </w:pPr>
+      <w:r>
+        <w:rPr>
+          <w:b/>
+          <w:bCs/>
+          <w:noProof/>
+          <w:u w:val="single"/>
+        </w:rPr>
+        <w:drawing>
+          <wp:inline distT="0" distB="0" distL="0" distR="0" wp14:anchorId="365BD73C" wp14:editId="3F4A9DDD">
+            <wp:extent cx="5943600" cy="3847465"/>
+            <wp:effectExtent l="0" t="0" r="0" b="635"/>
+            <wp:docPr id="1502070988" name="Picture 1" descr="A screen shot of a computer&#10;&#10;AI-generated content may be incorrect."/>
+            <wp:cNvGraphicFramePr>
+              <a:graphicFrameLocks xmlns:a="http://schemas.openxmlformats.org/drawingml/2006/main" noChangeAspect="1"/>
+            </wp:cNvGraphicFramePr>
+            <a:graphic xmlns:a="http://schemas.openxmlformats.org/drawingml/2006/main">
+              <a:graphicData uri="http://schemas.openxmlformats.org/drawingml/2006/picture">
+                <pic:pic xmlns:pic="http://schemas.openxmlformats.org/drawingml/2006/picture">
+                  <pic:nvPicPr>
+                    <pic:cNvPr id="1502070988" name="Picture 1" descr="A screen shot of a computer&#10;&#10;AI-generated content may be incorrect."/>
+                    <pic:cNvPicPr/>
+                  </pic:nvPicPr>
+                  <pic:blipFill>
+                    <a:blip r:embed="rId7" cstate="print">
+                      <a:extLst>
+                        <a:ext uri="{28A0092B-C50C-407E-A947-70E740481C1C}">
+                          <a14:useLocalDpi xmlns:a14="http://schemas.microsoft.com/office/drawing/2010/main" val="0"/>
+                        </a:ext>
+                      </a:extLst>
+                    </a:blip>
+                    <a:stretch>
+                      <a:fillRect/>
+                    </a:stretch>
+                  </pic:blipFill>
+                  <pic:spPr>
+                    <a:xfrm>
+                      <a:off x="0" y="0"/>
+                      <a:ext cx="5943600" cy="3847465"/>
+                    </a:xfrm>
+                    <a:prstGeom prst="rect">
+                      <a:avLst/>
+                    </a:prstGeom>
+                  </pic:spPr>
+                </pic:pic>
+              </a:graphicData>
+            </a:graphic>
+          </wp:inline>
+        </w:drawing>
+      </w:r>
+    </w:p>
+    <w:p>
+      <w:pPr>
+        <w:rPr>
+          <w:b/>
+          <w:bCs/>
+          <w:u w:val="single"/>
+        </w:rPr>
+      </w:pPr>
+      <w:r>
+        <w:rPr>
+          <w:b/>
+          <w:bCs/>
+          <w:noProof/>
+          <w:u w:val="single"/>
+        </w:rPr>
+        <w:lastRenderedPageBreak/>
+        <w:drawing>
+          <wp:inline distT="0" distB="0" distL="0" distR="0" wp14:anchorId="06B8BAE2" wp14:editId="0576F2BB">
+            <wp:extent cx="5943600" cy="3847465"/>
+            <wp:effectExtent l="0" t="0" r="0" b="635"/>
+            <wp:docPr id="646035704" name="Picture 2" descr="A screenshot of a computer&#10;&#10;AI-generated content may be incorrect."/>
+            <wp:cNvGraphicFramePr>
+              <a:graphicFrameLocks xmlns:a="http://schemas.openxmlformats.org/drawingml/2006/main" noChangeAspect="1"/>
+            </wp:cNvGraphicFramePr>
+            <a:graphic xmlns:a="http://schemas.openxmlformats.org/drawingml/2006/main">
+              <a:graphicData uri="http://schemas.openxmlformats.org/drawingml/2006/picture">
+                <pic:pic xmlns:pic="http://schemas.openxmlformats.org/drawingml/2006/picture">
+                  <pic:nvPicPr>
+                    <pic:cNvPr id="646035704" name="Picture 2" descr="A screenshot of a computer&#10;&#10;AI-generated content may be incorrect."/>
+                    <pic:cNvPicPr/>
+                  </pic:nvPicPr>
+                  <pic:blipFill>
+                    <a:blip r:embed="rId8" cstate="print">
+                      <a:extLst>
+                        <a:ext uri="{28A0092B-C50C-407E-A947-70E740481C1C}">
+                          <a14:useLocalDpi xmlns:a14="http://schemas.microsoft.com/office/drawing/2010/main" val="0"/>
+                        </a:ext>
+                      </a:extLst>
+                    </a:blip>
+                    <a:stretch>
+                      <a:fillRect/>
+                    </a:stretch>
+                  </pic:blipFill>
+                  <pic:spPr>
+                    <a:xfrm>
+                      <a:off x="0" y="0"/>
+                      <a:ext cx="5943600" cy="3847465"/>
+                    </a:xfrm>
+                    <a:prstGeom prst="rect">
+                      <a:avLst/>
+                    </a:prstGeom>
+                  </pic:spPr>
+                </pic:pic>
+              </a:graphicData>
+            </a:graphic>
+          </wp:inline>
+        </w:drawing>
+      </w:r>
+    </w:p>
+    <w:p>
+      <w:r>
+        <w:t>What I worked on</w:t>
+      </w:r>
+    </w:p>
+    <w:p>
+      <w:pPr>
+        <w:pStyle w:val="ListParagraph"/>
+        <w:numPr>
+          <w:ilvl w:val="0"/>
+          <w:numId w:val="1"/>
+        </w:numPr>
+      </w:pPr>
+      <w:r>
+        <w:t>Roofus</w:t>
+      </w:r>
+    </w:p>
+    <w:p>
+      <w:pPr>
+        <w:pStyle w:val="ListParagraph"/>
+        <w:numPr>
+          <w:ilvl w:val="1"/>
+          <w:numId w:val="1"/>
+        </w:numPr>
+      </w:pPr>
+      <w:r>
+        <w:t>Made roofus follow the player</w:t>
+      </w:r>
+    </w:p>
+    <w:p>
+      <w:pPr>
+        <w:pStyle w:val="ListParagraph"/>
+        <w:numPr>
+          <w:ilvl w:val="1"/>
+          <w:numId w:val="1"/>
+        </w:numPr>
+      </w:pPr>
+      <w:r>
+        <w:t>Made roofus spawn smaller  ‘minions’ every attack</w:t>
+      </w:r>
+    </w:p>
+    <w:p>
+      <w:pPr>
+        <w:pStyle w:val="ListParagraph"/>
+        <w:numPr>
+          <w:ilvl w:val="0"/>
+          <w:numId w:val="1"/>
+        </w:numPr>
+      </w:pPr>
+      <w:r>
+        <w:t>Minion</w:t>
+      </w:r>
+    </w:p>
+    <w:p>
+      <w:pPr>
+        <w:pStyle w:val="ListParagraph"/>
+        <w:numPr>
+          <w:ilvl w:val="1"/>
+          <w:numId w:val="1"/>
+        </w:numPr>
+      </w:pPr>
+      <w:r>
+        <w:t>Follows the player</w:t>
+      </w:r>
+    </w:p>
+    <w:p>
+      <w:pPr>
+        <w:pStyle w:val="ListParagraph"/>
+        <w:numPr>
+          <w:ilvl w:val="0"/>
+          <w:numId w:val="1"/>
+        </w:numPr>
+      </w:pPr>
+      <w:r>
+        <w:t>Added weapons like knife that enemies and players can wield and use</w:t>
+      </w:r>
+    </w:p>
+    <w:p>
+      <w:pPr>
+        <w:pStyle w:val="ListParagraph"/>
+        <w:numPr>
+          <w:ilvl w:val="0"/>
+          <w:numId w:val="1"/>
+        </w:numPr>
+      </w:pPr>
+      <w:r>
+        <w:t>Added HP for all enemies</w:t>
+      </w:r>
+    </w:p>
+    <w:p>
+      <w:pPr>
+        <w:pStyle w:val="ListParagraph"/>
+        <w:numPr>
+          <w:ilvl w:val="0"/>
+          <w:numId w:val="1"/>
+        </w:numPr>
+      </w:pPr>
+      <w:r>
+        <w:t>Added an animated health bar for the player at the top of the screen</w:t>
+      </w:r>
+    </w:p>
+    <w:p>
+      <w:pPr>
+        <w:pStyle w:val="ListParagraph"/>
+        <w:numPr>
+          <w:ilvl w:val="0"/>
+          <w:numId w:val="1"/>
+        </w:numPr>
+      </w:pPr>
+      <w:r>
+        <w:t>Added a game over screen</w:t>
+      </w:r>
+    </w:p>
+    <w:p>
+      <w:r>
+        <w:t>Problems</w:t>
+      </w:r>
+    </w:p>
+    <w:p>
+      <w:pPr>
+        <w:pStyle w:val="ListParagraph"/>
+        <w:numPr>
+          <w:ilvl w:val="0"/>
+          <w:numId w:val="1"/>
+        </w:numPr>
+      </w:pPr>
+      <w:r>
+        <w:t>None</w:t>
+      </w:r>
+    </w:p>
+    <w:p>
+      <w:r>
+        <w:t>Next class</w:t>
+      </w:r>
+    </w:p>
+    <w:p>
+      <w:pPr>
+        <w:pStyle w:val="ListParagraph"/>
+        <w:numPr>
+          <w:ilvl w:val="0"/>
+          <w:numId w:val="1"/>
+        </w:numPr>
+      </w:pPr>
+      <w:r>
+        <w:t>Add ‘flags’ or collectables. 15 to win or something similar</w:t>
+      </w:r>
+    </w:p>
+    <w:p>
+      <w:pPr>
+        <w:pStyle w:val="ListParagraph"/>
+        <w:numPr>
+          <w:ilvl w:val="1"/>
+          <w:numId w:val="1"/>
+        </w:numPr>
+      </w:pPr>
+      <w:r>
+        <w:t>Collectable interface?</w:t>
+      </w:r>
+    </w:p>
+    <w:p/>
     <w:sectPr>
       <w:type w:val="evenPage"/>
       <w:pgSz w:w="12240" w:h="15840"/>

</xml_diff>

<commit_message>
Refactor entity and body classes, add BoringZombie
Refactored Body, Entity, and related classes to decouple velocity/acceleration from Body and move them to Entity. Updated collision and grounded logic to support upside-down entities and improved collision resolution. Added BoringZombie enemy class, removed FlyingDog, and made various improvements to weapons, items, health bars, and platform rendering. Updated Layer to optimize entity updates and display based on viewport. General code cleanup and bug fixes throughout.
</commit_message>
<xml_diff>
--- a/StudentFolders/A1/29kingstont/side_scroller/side scroller plan.docx
+++ b/StudentFolders/A1/29kingstont/side_scroller/side scroller plan.docx
@@ -3032,6 +3032,443 @@
       </w:pPr>
       <w:r>
         <w:t>Collectable interface?</w:t>
+      </w:r>
+    </w:p>
+    <w:p/>
+    <w:p>
+      <w:pPr>
+        <w:rPr>
+          <w:b/>
+          <w:bCs/>
+          <w:u w:val="single"/>
+        </w:rPr>
+      </w:pPr>
+      <w:r>
+        <w:rPr>
+          <w:b/>
+          <w:bCs/>
+          <w:u w:val="single"/>
+        </w:rPr>
+        <w:lastRenderedPageBreak/>
+        <w:t>Day 9 – Nov. 26, 2025</w:t>
+      </w:r>
+    </w:p>
+    <w:p>
+      <w:r>
+        <w:rPr>
+          <w:noProof/>
+        </w:rPr>
+        <w:drawing>
+          <wp:inline distT="0" distB="0" distL="0" distR="0" wp14:anchorId="201E25DD" wp14:editId="41EC933B">
+            <wp:extent cx="5943600" cy="3385185"/>
+            <wp:effectExtent l="0" t="0" r="0" b="5715"/>
+            <wp:docPr id="719136949" name="Picture 1" descr="A video game with two people in a video game&#10;&#10;AI-generated content may be incorrect."/>
+            <wp:cNvGraphicFramePr>
+              <a:graphicFrameLocks xmlns:a="http://schemas.openxmlformats.org/drawingml/2006/main" noChangeAspect="1"/>
+            </wp:cNvGraphicFramePr>
+            <a:graphic xmlns:a="http://schemas.openxmlformats.org/drawingml/2006/main">
+              <a:graphicData uri="http://schemas.openxmlformats.org/drawingml/2006/picture">
+                <pic:pic xmlns:pic="http://schemas.openxmlformats.org/drawingml/2006/picture">
+                  <pic:nvPicPr>
+                    <pic:cNvPr id="719136949" name="Picture 1" descr="A video game with two people in a video game&#10;&#10;AI-generated content may be incorrect."/>
+                    <pic:cNvPicPr/>
+                  </pic:nvPicPr>
+                  <pic:blipFill>
+                    <a:blip r:embed="rId9" cstate="print">
+                      <a:extLst>
+                        <a:ext uri="{28A0092B-C50C-407E-A947-70E740481C1C}">
+                          <a14:useLocalDpi xmlns:a14="http://schemas.microsoft.com/office/drawing/2010/main" val="0"/>
+                        </a:ext>
+                      </a:extLst>
+                    </a:blip>
+                    <a:stretch>
+                      <a:fillRect/>
+                    </a:stretch>
+                  </pic:blipFill>
+                  <pic:spPr>
+                    <a:xfrm>
+                      <a:off x="0" y="0"/>
+                      <a:ext cx="5943600" cy="3385185"/>
+                    </a:xfrm>
+                    <a:prstGeom prst="rect">
+                      <a:avLst/>
+                    </a:prstGeom>
+                  </pic:spPr>
+                </pic:pic>
+              </a:graphicData>
+            </a:graphic>
+          </wp:inline>
+        </w:drawing>
+      </w:r>
+    </w:p>
+    <w:p>
+      <w:pPr>
+        <w:rPr>
+          <w:i/>
+          <w:iCs/>
+        </w:rPr>
+      </w:pPr>
+      <w:r>
+        <w:rPr>
+          <w:i/>
+          <w:iCs/>
+        </w:rPr>
+        <w:t xml:space="preserve">The red stuff </w:t>
+      </w:r>
+      <w:r>
+        <w:rPr>
+          <w:i/>
+          <w:iCs/>
+        </w:rPr>
+        <w:t>are the dysfunctional bullets</w:t>
+      </w:r>
+    </w:p>
+    <w:p>
+      <w:r>
+        <w:t>What I worked on</w:t>
+      </w:r>
+    </w:p>
+    <w:p>
+      <w:pPr>
+        <w:pStyle w:val="ListParagraph"/>
+        <w:numPr>
+          <w:ilvl w:val="0"/>
+          <w:numId w:val="1"/>
+        </w:numPr>
+      </w:pPr>
+      <w:r>
+        <w:t>Added an item menu</w:t>
+      </w:r>
+    </w:p>
+    <w:p>
+      <w:pPr>
+        <w:pStyle w:val="ListParagraph"/>
+        <w:numPr>
+          <w:ilvl w:val="0"/>
+          <w:numId w:val="1"/>
+        </w:numPr>
+      </w:pPr>
+      <w:r>
+        <w:t>Created a disfunctional gun and bullet system</w:t>
+      </w:r>
+    </w:p>
+    <w:p>
+      <w:pPr>
+        <w:pStyle w:val="ListParagraph"/>
+        <w:numPr>
+          <w:ilvl w:val="0"/>
+          <w:numId w:val="1"/>
+        </w:numPr>
+      </w:pPr>
+      <w:r>
+        <w:t>Made terrain vary in height!!</w:t>
+      </w:r>
+    </w:p>
+    <w:p>
+      <w:pPr>
+        <w:pStyle w:val="ListParagraph"/>
+        <w:numPr>
+          <w:ilvl w:val="1"/>
+          <w:numId w:val="1"/>
+        </w:numPr>
+      </w:pPr>
+      <w:r>
+        <w:t>It generates random heights in multiples of 40</w:t>
+      </w:r>
+    </w:p>
+    <w:p>
+      <w:r>
+        <w:t>Problems</w:t>
+      </w:r>
+    </w:p>
+    <w:p>
+      <w:pPr>
+        <w:pStyle w:val="ListParagraph"/>
+        <w:numPr>
+          <w:ilvl w:val="0"/>
+          <w:numId w:val="1"/>
+        </w:numPr>
+      </w:pPr>
+      <w:r>
+        <w:t>None</w:t>
+      </w:r>
+    </w:p>
+    <w:p>
+      <w:r>
+        <w:t>Next 2 classes</w:t>
+      </w:r>
+    </w:p>
+    <w:p>
+      <w:pPr>
+        <w:pStyle w:val="ListParagraph"/>
+        <w:numPr>
+          <w:ilvl w:val="0"/>
+          <w:numId w:val="1"/>
+        </w:numPr>
+      </w:pPr>
+      <w:r>
+        <w:t>Make bullets shoot properly</w:t>
+      </w:r>
+    </w:p>
+    <w:p>
+      <w:pPr>
+        <w:pStyle w:val="ListParagraph"/>
+        <w:numPr>
+          <w:ilvl w:val="0"/>
+          <w:numId w:val="1"/>
+        </w:numPr>
+      </w:pPr>
+      <w:r>
+        <w:t>Add the reload feature for guns</w:t>
+      </w:r>
+    </w:p>
+    <w:p>
+      <w:pPr>
+        <w:pStyle w:val="ListParagraph"/>
+        <w:numPr>
+          <w:ilvl w:val="0"/>
+          <w:numId w:val="1"/>
+        </w:numPr>
+      </w:pPr>
+      <w:r>
+        <w:t>Add ‘flags’ or collectables. 15 to win or something similar</w:t>
+      </w:r>
+    </w:p>
+    <w:p>
+      <w:pPr>
+        <w:pStyle w:val="ListParagraph"/>
+        <w:numPr>
+          <w:ilvl w:val="0"/>
+          <w:numId w:val="1"/>
+        </w:numPr>
+      </w:pPr>
+      <w:r>
+        <w:t>Work on procedural generation of platforms</w:t>
+      </w:r>
+    </w:p>
+    <w:p/>
+    <w:p/>
+    <w:p/>
+    <w:p>
+      <w:pPr>
+        <w:rPr>
+          <w:b/>
+          <w:bCs/>
+          <w:u w:val="single"/>
+        </w:rPr>
+      </w:pPr>
+      <w:r>
+        <w:rPr>
+          <w:b/>
+          <w:bCs/>
+          <w:u w:val="single"/>
+        </w:rPr>
+        <w:lastRenderedPageBreak/>
+        <w:t>Day 10 – Dec. 2, 2025 (IT’S DECEMBER!!!!!!!!!)</w:t>
+      </w:r>
+    </w:p>
+    <w:p>
+      <w:r>
+        <w:rPr>
+          <w:noProof/>
+        </w:rPr>
+        <w:drawing>
+          <wp:inline distT="0" distB="0" distL="0" distR="0" wp14:anchorId="669FFD99" wp14:editId="23D42725">
+            <wp:extent cx="5943600" cy="4088130"/>
+            <wp:effectExtent l="0" t="0" r="0" b="0"/>
+            <wp:docPr id="1308517874" name="Picture 1" descr="A screenshot of a video game&#10;&#10;AI-generated content may be incorrect."/>
+            <wp:cNvGraphicFramePr>
+              <a:graphicFrameLocks xmlns:a="http://schemas.openxmlformats.org/drawingml/2006/main" noChangeAspect="1"/>
+            </wp:cNvGraphicFramePr>
+            <a:graphic xmlns:a="http://schemas.openxmlformats.org/drawingml/2006/main">
+              <a:graphicData uri="http://schemas.openxmlformats.org/drawingml/2006/picture">
+                <pic:pic xmlns:pic="http://schemas.openxmlformats.org/drawingml/2006/picture">
+                  <pic:nvPicPr>
+                    <pic:cNvPr id="1308517874" name="Picture 1" descr="A screenshot of a video game&#10;&#10;AI-generated content may be incorrect."/>
+                    <pic:cNvPicPr/>
+                  </pic:nvPicPr>
+                  <pic:blipFill>
+                    <a:blip r:embed="rId10" cstate="print">
+                      <a:extLst>
+                        <a:ext uri="{28A0092B-C50C-407E-A947-70E740481C1C}">
+                          <a14:useLocalDpi xmlns:a14="http://schemas.microsoft.com/office/drawing/2010/main" val="0"/>
+                        </a:ext>
+                      </a:extLst>
+                    </a:blip>
+                    <a:stretch>
+                      <a:fillRect/>
+                    </a:stretch>
+                  </pic:blipFill>
+                  <pic:spPr>
+                    <a:xfrm>
+                      <a:off x="0" y="0"/>
+                      <a:ext cx="5943600" cy="4088130"/>
+                    </a:xfrm>
+                    <a:prstGeom prst="rect">
+                      <a:avLst/>
+                    </a:prstGeom>
+                  </pic:spPr>
+                </pic:pic>
+              </a:graphicData>
+            </a:graphic>
+          </wp:inline>
+        </w:drawing>
+      </w:r>
+    </w:p>
+    <w:p>
+      <w:r>
+        <w:t>What I worked on</w:t>
+      </w:r>
+    </w:p>
+    <w:p>
+      <w:pPr>
+        <w:pStyle w:val="ListParagraph"/>
+        <w:numPr>
+          <w:ilvl w:val="0"/>
+          <w:numId w:val="1"/>
+        </w:numPr>
+      </w:pPr>
+      <w:r>
+        <w:t>Massive optimizations</w:t>
+      </w:r>
+    </w:p>
+    <w:p>
+      <w:pPr>
+        <w:pStyle w:val="ListParagraph"/>
+        <w:numPr>
+          <w:ilvl w:val="0"/>
+          <w:numId w:val="1"/>
+        </w:numPr>
+      </w:pPr>
+      <w:r>
+        <w:t>A light source that follows the player</w:t>
+      </w:r>
+    </w:p>
+    <w:p>
+      <w:pPr>
+        <w:pStyle w:val="ListParagraph"/>
+        <w:numPr>
+          <w:ilvl w:val="0"/>
+          <w:numId w:val="1"/>
+        </w:numPr>
+      </w:pPr>
+      <w:r>
+        <w:t>An ‘upside down’ that you can flip to</w:t>
+      </w:r>
+    </w:p>
+    <w:p>
+      <w:pPr>
+        <w:pStyle w:val="ListParagraph"/>
+        <w:numPr>
+          <w:ilvl w:val="0"/>
+          <w:numId w:val="1"/>
+        </w:numPr>
+      </w:pPr>
+      <w:r>
+        <w:t>Fall damage</w:t>
+      </w:r>
+    </w:p>
+    <w:p>
+      <w:pPr>
+        <w:pStyle w:val="ListParagraph"/>
+        <w:numPr>
+          <w:ilvl w:val="0"/>
+          <w:numId w:val="1"/>
+        </w:numPr>
+      </w:pPr>
+      <w:r>
+        <w:t>Trampolines that you should be able to boost yourself with</w:t>
+      </w:r>
+    </w:p>
+    <w:p>
+      <w:pPr>
+        <w:pStyle w:val="ListParagraph"/>
+        <w:numPr>
+          <w:ilvl w:val="0"/>
+          <w:numId w:val="1"/>
+        </w:numPr>
+      </w:pPr>
+      <w:r>
+        <w:t>Guns now reload</w:t>
+      </w:r>
+    </w:p>
+    <w:p>
+      <w:r>
+        <w:t>Minor p</w:t>
+      </w:r>
+      <w:r>
+        <w:t>roblems</w:t>
+      </w:r>
+    </w:p>
+    <w:p>
+      <w:pPr>
+        <w:pStyle w:val="ListParagraph"/>
+        <w:numPr>
+          <w:ilvl w:val="0"/>
+          <w:numId w:val="1"/>
+        </w:numPr>
+      </w:pPr>
+      <w:r>
+        <w:t>Bullets spawn under the gun</w:t>
+      </w:r>
+    </w:p>
+    <w:p>
+      <w:r>
+        <w:t>Major problems</w:t>
+      </w:r>
+    </w:p>
+    <w:p>
+      <w:pPr>
+        <w:pStyle w:val="ListParagraph"/>
+        <w:numPr>
+          <w:ilvl w:val="0"/>
+          <w:numId w:val="1"/>
+        </w:numPr>
+      </w:pPr>
+      <w:r>
+        <w:t>The player phases through certain platforms (trampolines) when velocity is fast enough</w:t>
+      </w:r>
+    </w:p>
+    <w:p>
+      <w:r>
+        <w:t>Next 2 classes</w:t>
+      </w:r>
+    </w:p>
+    <w:p>
+      <w:pPr>
+        <w:pStyle w:val="ListParagraph"/>
+        <w:numPr>
+          <w:ilvl w:val="0"/>
+          <w:numId w:val="1"/>
+        </w:numPr>
+      </w:pPr>
+      <w:r>
+        <w:lastRenderedPageBreak/>
+        <w:t>Add ‘flags’ or collectables. 15 to win or something similar</w:t>
+      </w:r>
+    </w:p>
+    <w:p>
+      <w:pPr>
+        <w:pStyle w:val="ListParagraph"/>
+        <w:numPr>
+          <w:ilvl w:val="0"/>
+          <w:numId w:val="1"/>
+        </w:numPr>
+      </w:pPr>
+      <w:r>
+        <w:t>Work on procedural generation of platforms</w:t>
+      </w:r>
+    </w:p>
+    <w:p>
+      <w:pPr>
+        <w:pStyle w:val="ListParagraph"/>
+        <w:numPr>
+          <w:ilvl w:val="0"/>
+          <w:numId w:val="1"/>
+        </w:numPr>
+      </w:pPr>
+      <w:r>
+        <w:t>Fix trampolines</w:t>
       </w:r>
     </w:p>
     <w:p/>
@@ -3658,7 +4095,7 @@
   <w:style w:type="paragraph" w:default="1" w:styleId="Normal">
     <w:name w:val="Normal"/>
     <w:qFormat/>
-    <w:rsid w:val="00E832A7"/>
+    <w:rsid w:val="00393E3E"/>
   </w:style>
   <w:style w:type="paragraph" w:styleId="Heading1">
     <w:name w:val="heading 1"/>

</xml_diff>

<commit_message>
Refactor and expand game entities, add item entities
Introduces a new ItemEntity class for items in the world, adds a Vestido enemy, and centralizes constants in a new Constants.pde file. Refactors entity and item interfaces for consistency, updates method names for clarity (e.g., getIsDead), and improves enemy spawning logic. Also updates terrain, weapon, and item handling to use new constants and interfaces, and fixes various bugs and inconsistencies across the codebase.
</commit_message>
<xml_diff>
--- a/StudentFolders/A1/29kingstont/side_scroller/side scroller plan.docx
+++ b/StudentFolders/A1/29kingstont/side_scroller/side scroller plan.docx
@@ -1640,7 +1640,25 @@
         <w:t>Get basic character movement working</w:t>
       </w:r>
       <w:r>
-        <w:t xml:space="preserve"> (Meeple class + </w:t>
+        <w:t xml:space="preserve"> </w:t>
+      </w:r>
+    </w:p>
+    <w:p>
+      <w:pPr>
+        <w:pStyle w:val="ListParagraph"/>
+        <w:numPr>
+          <w:ilvl w:val="1"/>
+          <w:numId w:val="1"/>
+        </w:numPr>
+      </w:pPr>
+      <w:r>
+        <w:t xml:space="preserve">I created a </w:t>
+      </w:r>
+      <w:r>
+        <w:t xml:space="preserve">Meeple class </w:t>
+      </w:r>
+      <w:r>
+        <w:t xml:space="preserve">and got user inputs working with my library, </w:t>
       </w:r>
       <w:r>
         <w:rPr>
@@ -1649,35 +1667,20 @@
         </w:rPr>
         <w:t>MR KEYBOARD!!!</w:t>
       </w:r>
-      <w:r>
-        <w:t>)</w:t>
-      </w:r>
-    </w:p>
-    <w:p>
-      <w:pPr>
-        <w:pStyle w:val="ListParagraph"/>
-        <w:numPr>
-          <w:ilvl w:val="0"/>
-          <w:numId w:val="1"/>
-        </w:numPr>
-      </w:pPr>
-      <w:r>
-        <w:t>Work on procedural generation</w:t>
-      </w:r>
-      <w:r>
-        <w:t xml:space="preserve"> (World &amp; Terrain class)</w:t>
-      </w:r>
-    </w:p>
-    <w:p>
-      <w:pPr>
-        <w:pStyle w:val="ListParagraph"/>
-        <w:numPr>
-          <w:ilvl w:val="0"/>
-          <w:numId w:val="1"/>
-        </w:numPr>
-      </w:pPr>
-      <w:r>
-        <w:t>Created basic classes for future use</w:t>
+    </w:p>
+    <w:p>
+      <w:pPr>
+        <w:pStyle w:val="ListParagraph"/>
+        <w:numPr>
+          <w:ilvl w:val="0"/>
+          <w:numId w:val="1"/>
+        </w:numPr>
+      </w:pPr>
+      <w:r>
+        <w:t>Began work</w:t>
+      </w:r>
+      <w:r>
+        <w:t xml:space="preserve"> on procedural generation</w:t>
       </w:r>
     </w:p>
     <w:p>
@@ -1689,8 +1692,62 @@
         </w:numPr>
       </w:pPr>
       <w:r>
+        <w:t xml:space="preserve">I created a </w:t>
+      </w:r>
+      <w:r>
+        <w:t xml:space="preserve">World </w:t>
+      </w:r>
+      <w:r>
+        <w:t>class that will help manage the game world and a</w:t>
+      </w:r>
+      <w:r>
+        <w:t xml:space="preserve"> Terrain class</w:t>
+      </w:r>
+      <w:r>
+        <w:t xml:space="preserve"> that will act as the procedurally generating floor.</w:t>
+      </w:r>
+    </w:p>
+    <w:p>
+      <w:pPr>
+        <w:pStyle w:val="ListParagraph"/>
+        <w:numPr>
+          <w:ilvl w:val="0"/>
+          <w:numId w:val="1"/>
+        </w:numPr>
+      </w:pPr>
+      <w:r>
+        <w:t xml:space="preserve">Created </w:t>
+      </w:r>
+      <w:r>
+        <w:t xml:space="preserve">other </w:t>
+      </w:r>
+      <w:r>
+        <w:t>basic classes for future use</w:t>
+      </w:r>
+    </w:p>
+    <w:p>
+      <w:pPr>
+        <w:pStyle w:val="ListParagraph"/>
+        <w:numPr>
+          <w:ilvl w:val="1"/>
+          <w:numId w:val="1"/>
+        </w:numPr>
+      </w:pPr>
+      <w:r>
+        <w:t xml:space="preserve">The </w:t>
+      </w:r>
+      <w:r>
         <w:t>Displayable</w:t>
       </w:r>
+      <w:r>
+        <w:t xml:space="preserve"> class </w:t>
+      </w:r>
+      <w:r>
+        <w:rPr>
+          <w:color w:val="EE0000"/>
+        </w:rPr>
+        <w:t>(later removed with an interface taking its place)</w:t>
+      </w:r>
     </w:p>
     <w:p>
       <w:pPr>
@@ -1703,6 +1760,9 @@
       <w:r>
         <w:t>Static</w:t>
       </w:r>
+      <w:r>
+        <w:t xml:space="preserve"> class</w:t>
+      </w:r>
     </w:p>
     <w:p>
       <w:pPr>
@@ -1727,6 +1787,15 @@
       <w:r>
         <w:t>Tree (unfinished)</w:t>
       </w:r>
+      <w:r>
+        <w:t xml:space="preserve"> </w:t>
+      </w:r>
+      <w:r>
+        <w:rPr>
+          <w:color w:val="EE0000"/>
+        </w:rPr>
+        <w:t>(later removed)</w:t>
+      </w:r>
     </w:p>
     <w:p>
       <w:pPr>
@@ -1739,6 +1808,15 @@
       <w:r>
         <w:t>Movable</w:t>
       </w:r>
+      <w:r>
+        <w:t xml:space="preserve"> class </w:t>
+      </w:r>
+      <w:r>
+        <w:rPr>
+          <w:color w:val="EE0000"/>
+        </w:rPr>
+        <w:t>(later renamed to Entity)</w:t>
+      </w:r>
     </w:p>
     <w:p>
       <w:pPr>
@@ -1749,7 +1827,13 @@
         </w:numPr>
       </w:pPr>
       <w:r>
-        <w:t>Interactible (unfinished)</w:t>
+        <w:t xml:space="preserve">Interactible </w:t>
+      </w:r>
+      <w:r>
+        <w:rPr>
+          <w:color w:val="EE0000"/>
+        </w:rPr>
+        <w:t>(later removed)</w:t>
       </w:r>
     </w:p>
     <w:p>
@@ -1780,6 +1864,30 @@
       <w:pPr>
         <w:pStyle w:val="ListParagraph"/>
         <w:numPr>
+          <w:ilvl w:val="2"/>
+          <w:numId w:val="1"/>
+        </w:numPr>
+      </w:pPr>
+      <w:r>
+        <w:t>This is for the layer rendering system that allows for foreground and background.</w:t>
+      </w:r>
+    </w:p>
+    <w:p>
+      <w:pPr>
+        <w:pStyle w:val="ListParagraph"/>
+        <w:numPr>
+          <w:ilvl w:val="2"/>
+          <w:numId w:val="1"/>
+        </w:numPr>
+      </w:pPr>
+      <w:r>
+        <w:t>Responsible for rendering entities and static objects.</w:t>
+      </w:r>
+    </w:p>
+    <w:p>
+      <w:pPr>
+        <w:pStyle w:val="ListParagraph"/>
+        <w:numPr>
           <w:ilvl w:val="1"/>
           <w:numId w:val="1"/>
         </w:numPr>
@@ -1792,6 +1900,18 @@
       <w:pPr>
         <w:pStyle w:val="ListParagraph"/>
         <w:numPr>
+          <w:ilvl w:val="2"/>
+          <w:numId w:val="1"/>
+        </w:numPr>
+      </w:pPr>
+      <w:r>
+        <w:t>Responsible for the day-night cycle and other weather related things.</w:t>
+      </w:r>
+    </w:p>
+    <w:p>
+      <w:pPr>
+        <w:pStyle w:val="ListParagraph"/>
+        <w:numPr>
           <w:ilvl w:val="1"/>
           <w:numId w:val="1"/>
         </w:numPr>
@@ -1804,6 +1924,18 @@
       <w:pPr>
         <w:pStyle w:val="ListParagraph"/>
         <w:numPr>
+          <w:ilvl w:val="2"/>
+          <w:numId w:val="1"/>
+        </w:numPr>
+      </w:pPr>
+      <w:r>
+        <w:t>Responsible for the game world.</w:t>
+      </w:r>
+    </w:p>
+    <w:p>
+      <w:pPr>
+        <w:pStyle w:val="ListParagraph"/>
+        <w:numPr>
           <w:ilvl w:val="1"/>
           <w:numId w:val="1"/>
         </w:numPr>
@@ -1816,18 +1948,12 @@
       <w:pPr>
         <w:pStyle w:val="ListParagraph"/>
         <w:numPr>
-          <w:ilvl w:val="0"/>
-          <w:numId w:val="1"/>
-        </w:numPr>
-      </w:pPr>
-      <w:r>
-        <w:t>Layering r</w:t>
-      </w:r>
-      <w:r>
-        <w:t>endering system</w:t>
-      </w:r>
-      <w:r>
-        <w:t xml:space="preserve"> (Layer class)</w:t>
+          <w:ilvl w:val="2"/>
+          <w:numId w:val="1"/>
+        </w:numPr>
+      </w:pPr>
+      <w:r>
+        <w:t>Responsible for the floor.</w:t>
       </w:r>
     </w:p>
     <w:p>
@@ -1844,7 +1970,25 @@
         </w:numPr>
       </w:pPr>
       <w:r>
-        <w:t>Performance issues: the layering system where you submit dynamic items each frame slows down the sketch (slightly noticably)</w:t>
+        <w:t xml:space="preserve">Performance issues: the layering system </w:t>
+      </w:r>
+      <w:r>
+        <w:t>currently requires the World class to</w:t>
+      </w:r>
+      <w:r>
+        <w:t xml:space="preserve"> submit dynamic items each frame</w:t>
+      </w:r>
+      <w:r>
+        <w:t xml:space="preserve">, </w:t>
+      </w:r>
+      <w:r>
+        <w:t>slow</w:t>
+      </w:r>
+      <w:r>
+        <w:t>ing</w:t>
+      </w:r>
+      <w:r>
+        <w:t xml:space="preserve"> down the sketch (slightly noticably)</w:t>
       </w:r>
     </w:p>
     <w:p>
@@ -1902,6 +2046,7 @@
           <w:bCs/>
           <w:u w:val="single"/>
         </w:rPr>
+        <w:lastRenderedPageBreak/>
         <w:t>Day 2 – Nov. 6, 2025</w:t>
       </w:r>
     </w:p>
@@ -1937,7 +2082,10 @@
         <w:t xml:space="preserve"> and removing the next frame</w:t>
       </w:r>
       <w:r>
-        <w:t>, it now stores entities and removes by ID if necessary</w:t>
+        <w:t xml:space="preserve">, it now stores entities and removes </w:t>
+      </w:r>
+      <w:r>
+        <w:t>them when dead.</w:t>
       </w:r>
     </w:p>
     <w:p>
@@ -1961,23 +2109,61 @@
         </w:numPr>
       </w:pPr>
       <w:r>
-        <w:t>Added an incrementing ID (0 for first, 1 for second, etc.)</w:t>
-      </w:r>
-    </w:p>
-    <w:p>
-      <w:pPr>
-        <w:pStyle w:val="ListParagraph"/>
-        <w:numPr>
-          <w:ilvl w:val="0"/>
-          <w:numId w:val="1"/>
-        </w:numPr>
-      </w:pPr>
-      <w:r>
-        <w:lastRenderedPageBreak/>
-        <w:t>Added a dog</w:t>
-      </w:r>
-      <w:r>
-        <w:t xml:space="preserve"> entity as a test</w:t>
+        <w:t>I created the basic outline of the class</w:t>
+      </w:r>
+    </w:p>
+    <w:p>
+      <w:pPr>
+        <w:pStyle w:val="ListParagraph"/>
+        <w:numPr>
+          <w:ilvl w:val="1"/>
+          <w:numId w:val="1"/>
+        </w:numPr>
+      </w:pPr>
+      <w:r>
+        <w:t>I a</w:t>
+      </w:r>
+      <w:r>
+        <w:t>dded an incrementing ID (0 for first, 1 for second, etc.)</w:t>
+      </w:r>
+      <w:r>
+        <w:t xml:space="preserve"> system that may come in handy in the future.</w:t>
+      </w:r>
+    </w:p>
+    <w:p>
+      <w:pPr>
+        <w:pStyle w:val="ListParagraph"/>
+        <w:numPr>
+          <w:ilvl w:val="0"/>
+          <w:numId w:val="1"/>
+        </w:numPr>
+      </w:pPr>
+      <w:r>
+        <w:t>Created</w:t>
+      </w:r>
+      <w:r>
+        <w:t xml:space="preserve"> a </w:t>
+      </w:r>
+      <w:r>
+        <w:t xml:space="preserve">flying </w:t>
+      </w:r>
+      <w:r>
+        <w:t>dog</w:t>
+      </w:r>
+      <w:r>
+        <w:t xml:space="preserve"> (i.e., a circle)</w:t>
+      </w:r>
+      <w:r>
+        <w:t xml:space="preserve"> </w:t>
+      </w:r>
+      <w:r>
+        <w:t>class</w:t>
+      </w:r>
+      <w:r>
+        <w:t xml:space="preserve"> as a test</w:t>
+      </w:r>
+      <w:r>
+        <w:t xml:space="preserve"> of the Entity class</w:t>
       </w:r>
     </w:p>
     <w:p>
@@ -2090,7 +2276,22 @@
         </w:numPr>
       </w:pPr>
       <w:r>
-        <w:t>Added a Particle and Particle System class for future use</w:t>
+        <w:t>Created</w:t>
+      </w:r>
+      <w:r>
+        <w:t xml:space="preserve"> a Particle and Particle System class for future use</w:t>
+      </w:r>
+    </w:p>
+    <w:p>
+      <w:pPr>
+        <w:pStyle w:val="ListParagraph"/>
+        <w:numPr>
+          <w:ilvl w:val="1"/>
+          <w:numId w:val="1"/>
+        </w:numPr>
+      </w:pPr>
+      <w:r>
+        <w:t>Particle system origins can either remain stationary or attach to an entity. This is useful for particle effects such as dirt flying when the player walks on the ground.</w:t>
       </w:r>
     </w:p>
     <w:p>
@@ -2162,6 +2363,7 @@
           <w:noProof/>
           <w:u w:val="single"/>
         </w:rPr>
+        <w:lastRenderedPageBreak/>
         <w:drawing>
           <wp:inline distT="0" distB="0" distL="0" distR="0" wp14:anchorId="10150074" wp14:editId="3236231F">
             <wp:extent cx="3998563" cy="2286785"/>
@@ -2213,7 +2415,46 @@
         </w:numPr>
       </w:pPr>
       <w:r>
-        <w:t>Added a dirt particles that move when you’re on the floor</w:t>
+        <w:t xml:space="preserve">Added a dirt particles that </w:t>
+      </w:r>
+      <w:r>
+        <w:t>spawn</w:t>
+      </w:r>
+      <w:r>
+        <w:t xml:space="preserve"> when </w:t>
+      </w:r>
+      <w:r>
+        <w:t>the meeple is</w:t>
+      </w:r>
+      <w:r>
+        <w:t xml:space="preserve"> on the floor</w:t>
+      </w:r>
+      <w:r>
+        <w:t xml:space="preserve"> and moving</w:t>
+      </w:r>
+    </w:p>
+    <w:p>
+      <w:pPr>
+        <w:pStyle w:val="ListParagraph"/>
+        <w:numPr>
+          <w:ilvl w:val="1"/>
+          <w:numId w:val="1"/>
+        </w:numPr>
+      </w:pPr>
+      <w:r>
+        <w:t>As you can see in the image above, it is clearly scattering too far, but the basic concept is correct.</w:t>
+      </w:r>
+    </w:p>
+    <w:p>
+      <w:pPr>
+        <w:pStyle w:val="ListParagraph"/>
+        <w:numPr>
+          <w:ilvl w:val="1"/>
+          <w:numId w:val="1"/>
+        </w:numPr>
+      </w:pPr>
+      <w:r>
+        <w:t>It now attaches corretly to the meeple.</w:t>
       </w:r>
     </w:p>
     <w:p>
@@ -2230,7 +2471,6 @@
     </w:p>
     <w:p>
       <w:r>
-        <w:lastRenderedPageBreak/>
         <w:t>Problems</w:t>
       </w:r>
     </w:p>
@@ -2260,19 +2500,16 @@
         </w:numPr>
       </w:pPr>
       <w:r>
-        <w:t>Allowing flying on dogs</w:t>
-      </w:r>
-    </w:p>
-    <w:p>
-      <w:pPr>
-        <w:pStyle w:val="ListParagraph"/>
-        <w:numPr>
-          <w:ilvl w:val="0"/>
-          <w:numId w:val="1"/>
-        </w:numPr>
-      </w:pPr>
-      <w:r>
         <w:t>Make the game do all sorts of crazy things</w:t>
+      </w:r>
+      <w:r>
+        <w:t xml:space="preserve"> </w:t>
+      </w:r>
+      <w:r>
+        <w:rPr>
+          <w:color w:val="EE0000"/>
+        </w:rPr>
+        <w:t>(I realized this was too big of a scope for the time remaining so I later decided to create enemies and make it a winnable game)</w:t>
       </w:r>
     </w:p>
     <w:p>
@@ -2340,8 +2577,63 @@
         </w:numPr>
       </w:pPr>
       <w:r>
+        <w:t xml:space="preserve">Created a Body class that each Entity must </w:t>
+      </w:r>
+      <w:r>
+        <w:t>have. Bodies are responsible for physics like collisions, and entities are responsible for the kinematics (velocity, acceleration) as well as other state.</w:t>
+      </w:r>
+    </w:p>
+    <w:p>
+      <w:pPr>
+        <w:pStyle w:val="ListParagraph"/>
+        <w:numPr>
+          <w:ilvl w:val="1"/>
+          <w:numId w:val="1"/>
+        </w:numPr>
+      </w:pPr>
+      <w:r>
+        <w:t>RectBody</w:t>
+      </w:r>
+    </w:p>
+    <w:p>
+      <w:pPr>
+        <w:pStyle w:val="ListParagraph"/>
+        <w:numPr>
+          <w:ilvl w:val="1"/>
+          <w:numId w:val="1"/>
+        </w:numPr>
+      </w:pPr>
+      <w:r>
+        <w:lastRenderedPageBreak/>
+        <w:t xml:space="preserve">CircleBody </w:t>
+      </w:r>
+      <w:r>
+        <w:rPr>
+          <w:color w:val="EE0000"/>
+        </w:rPr>
+        <w:t>(later deprecated- it still exists but isn’t used and hasn’t been tested or updated as new features were added)</w:t>
+      </w:r>
+    </w:p>
+    <w:p>
+      <w:pPr>
+        <w:pStyle w:val="ListParagraph"/>
+        <w:numPr>
+          <w:ilvl w:val="0"/>
+          <w:numId w:val="1"/>
+        </w:numPr>
+      </w:pPr>
+      <w:r>
         <w:t>Scaffolding for the attach feature</w:t>
       </w:r>
+      <w:r>
+        <w:t xml:space="preserve"> where entities can attach onto other entities </w:t>
+      </w:r>
+      <w:r>
+        <w:rPr>
+          <w:color w:val="EE0000"/>
+        </w:rPr>
+        <w:t>(later removed)</w:t>
+      </w:r>
     </w:p>
     <w:p>
       <w:r>
@@ -2391,17 +2683,26 @@
       <w:r>
         <w:t>e</w:t>
       </w:r>
-    </w:p>
-    <w:p>
-      <w:pPr>
-        <w:pStyle w:val="ListParagraph"/>
-        <w:numPr>
-          <w:ilvl w:val="0"/>
-          <w:numId w:val="1"/>
-        </w:numPr>
-      </w:pPr>
-      <w:r>
-        <w:t>Platforms</w:t>
+      <w:r>
+        <w:t xml:space="preserve"> </w:t>
+      </w:r>
+      <w:r>
+        <w:rPr>
+          <w:color w:val="EE0000"/>
+        </w:rPr>
+        <w:t>(later removed)</w:t>
+      </w:r>
+    </w:p>
+    <w:p>
+      <w:pPr>
+        <w:pStyle w:val="ListParagraph"/>
+        <w:numPr>
+          <w:ilvl w:val="0"/>
+          <w:numId w:val="1"/>
+        </w:numPr>
+      </w:pPr>
+      <w:r>
+        <w:t>One-way platforms</w:t>
       </w:r>
       <w:r>
         <w:t xml:space="preserve"> (mario-style)</w:t>
@@ -2440,7 +2741,6 @@
           <w:noProof/>
           <w:u w:val="single"/>
         </w:rPr>
-        <w:lastRenderedPageBreak/>
         <w:drawing>
           <wp:inline distT="0" distB="0" distL="0" distR="0" wp14:anchorId="09B6F30B" wp14:editId="3FFCF2EE">
             <wp:extent cx="5943600" cy="3388995"/>
@@ -2498,19 +2798,104 @@
         </w:numPr>
       </w:pPr>
       <w:r>
-        <w:t>Added delta time: now, the sandbox should run at the same visually seem to run at the same speed regardless of the frame rate</w:t>
-      </w:r>
-    </w:p>
-    <w:p>
-      <w:pPr>
-        <w:pStyle w:val="ListParagraph"/>
-        <w:numPr>
-          <w:ilvl w:val="0"/>
-          <w:numId w:val="1"/>
-        </w:numPr>
-      </w:pPr>
-      <w:r>
-        <w:t>Added platforms</w:t>
+        <w:t>Created a basic debug system that allows me to optimize the program and easily cathc parts of the program that are taking too long to run (see above).</w:t>
+      </w:r>
+    </w:p>
+    <w:p>
+      <w:pPr>
+        <w:pStyle w:val="ListParagraph"/>
+        <w:numPr>
+          <w:ilvl w:val="0"/>
+          <w:numId w:val="1"/>
+        </w:numPr>
+      </w:pPr>
+      <w:r>
+        <w:t xml:space="preserve">Added delta time: now, the </w:t>
+      </w:r>
+      <w:r>
+        <w:t>game</w:t>
+      </w:r>
+      <w:r>
+        <w:t xml:space="preserve"> should run at the same visually seem to run at the same speed regardless of the frame rate</w:t>
+      </w:r>
+    </w:p>
+    <w:p>
+      <w:pPr>
+        <w:pStyle w:val="ListParagraph"/>
+        <w:numPr>
+          <w:ilvl w:val="0"/>
+          <w:numId w:val="1"/>
+        </w:numPr>
+      </w:pPr>
+      <w:r>
+        <w:lastRenderedPageBreak/>
+        <w:t>Created a static class Collision and CollisionResult</w:t>
+      </w:r>
+    </w:p>
+    <w:p>
+      <w:pPr>
+        <w:pStyle w:val="ListParagraph"/>
+        <w:numPr>
+          <w:ilvl w:val="1"/>
+          <w:numId w:val="1"/>
+        </w:numPr>
+      </w:pPr>
+      <w:r>
+        <w:t>Responsible for checking for collisions and returning collision data</w:t>
+      </w:r>
+    </w:p>
+    <w:p>
+      <w:pPr>
+        <w:pStyle w:val="ListParagraph"/>
+        <w:numPr>
+          <w:ilvl w:val="0"/>
+          <w:numId w:val="1"/>
+        </w:numPr>
+      </w:pPr>
+      <w:r>
+        <w:t xml:space="preserve">Added </w:t>
+      </w:r>
+      <w:r>
+        <w:t xml:space="preserve">one-way </w:t>
+      </w:r>
+      <w:r>
+        <w:t>platforms</w:t>
+      </w:r>
+    </w:p>
+    <w:p>
+      <w:pPr>
+        <w:pStyle w:val="ListParagraph"/>
+        <w:numPr>
+          <w:ilvl w:val="1"/>
+          <w:numId w:val="1"/>
+        </w:numPr>
+      </w:pPr>
+      <w:r>
+        <w:t>These use Collision to check for collisions</w:t>
+      </w:r>
+    </w:p>
+    <w:p>
+      <w:pPr>
+        <w:pStyle w:val="ListParagraph"/>
+        <w:numPr>
+          <w:ilvl w:val="1"/>
+          <w:numId w:val="1"/>
+        </w:numPr>
+      </w:pPr>
+      <w:r>
+        <w:t>In order for one-way platforms to work, the previous positions of entities must be known</w:t>
+      </w:r>
+    </w:p>
+    <w:p>
+      <w:pPr>
+        <w:pStyle w:val="ListParagraph"/>
+        <w:numPr>
+          <w:ilvl w:val="2"/>
+          <w:numId w:val="1"/>
+        </w:numPr>
+      </w:pPr>
+      <w:r>
+        <w:t>This prevents entities from snapping to the platform when jumping up through it (under to over)</w:t>
       </w:r>
     </w:p>
     <w:p>
@@ -2556,7 +2941,37 @@
         </w:numPr>
       </w:pPr>
       <w:r>
-        <w:t>Removed ‘cached rendering’ (not really cached, but whatever) from bushes and trees which actually slowed down the program (drawing to a separate Pimage took longer than expected, leading to lag issues as each bush took 1ms to draw, way too long for the number of bushes on screen at a time.</w:t>
+        <w:t xml:space="preserve">Removed </w:t>
+      </w:r>
+      <w:r>
+        <w:t xml:space="preserve">the </w:t>
+      </w:r>
+      <w:r>
+        <w:t xml:space="preserve">‘cached rendering’ </w:t>
+      </w:r>
+      <w:r>
+        <w:t xml:space="preserve">system for static items </w:t>
+      </w:r>
+      <w:r>
+        <w:t xml:space="preserve">(not really cached, but whatever) which actually slowed down the program (drawing to a separate Pimage took longer than expected, leading to lag issues </w:t>
+      </w:r>
+      <w:r>
+        <w:t>such as how</w:t>
+      </w:r>
+      <w:r>
+        <w:t xml:space="preserve"> each bush </w:t>
+      </w:r>
+      <w:r>
+        <w:t>takes</w:t>
+      </w:r>
+      <w:r>
+        <w:t xml:space="preserve"> </w:t>
+      </w:r>
+      <w:r>
+        <w:t>more than 1</w:t>
+      </w:r>
+      <w:r>
+        <w:t>ms to draw, way too long for the number of bushes on screen at a time.</w:t>
       </w:r>
     </w:p>
     <w:p>
@@ -2573,7 +2988,16 @@
         </w:numPr>
       </w:pPr>
       <w:r>
-        <w:t>Platform collision (not only top collisions but also side-on collisions)</w:t>
+        <w:t>One-way p</w:t>
+      </w:r>
+      <w:r>
+        <w:t>latform collision</w:t>
+      </w:r>
+      <w:r>
+        <w:t xml:space="preserve"> doesn’t work as expected</w:t>
+      </w:r>
+      <w:r>
+        <w:t xml:space="preserve"> (not only top collisions but also side-on collisions)</w:t>
       </w:r>
     </w:p>
     <w:p>
@@ -2590,19 +3014,10 @@
         </w:numPr>
       </w:pPr>
       <w:r>
-        <w:t>Fix platforms (mario style)</w:t>
-      </w:r>
-    </w:p>
-    <w:p>
-      <w:pPr>
-        <w:pStyle w:val="ListParagraph"/>
-        <w:numPr>
-          <w:ilvl w:val="0"/>
-          <w:numId w:val="1"/>
-        </w:numPr>
-      </w:pPr>
-      <w:r>
-        <w:t>Platform generation feature</w:t>
+        <w:t xml:space="preserve">Fix </w:t>
+      </w:r>
+      <w:r>
+        <w:t>one-way, mario-style platforms</w:t>
       </w:r>
     </w:p>
     <w:p>
@@ -2637,94 +3052,118 @@
           <w:bCs/>
           <w:u w:val="single"/>
         </w:rPr>
+        <w:t>Day 7 – Nov. 20, 2025</w:t>
+      </w:r>
+    </w:p>
+    <w:p>
+      <w:r>
+        <w:t>What I worked on</w:t>
+      </w:r>
+    </w:p>
+    <w:p>
+      <w:pPr>
+        <w:pStyle w:val="ListParagraph"/>
+        <w:numPr>
+          <w:ilvl w:val="0"/>
+          <w:numId w:val="1"/>
+        </w:numPr>
+      </w:pPr>
+      <w:r>
+        <w:t>Fixed the one-way</w:t>
+      </w:r>
+      <w:r>
+        <w:t xml:space="preserve"> platform</w:t>
+      </w:r>
+      <w:r>
+        <w:t xml:space="preserve"> collisions</w:t>
+      </w:r>
+    </w:p>
+    <w:p>
+      <w:pPr>
+        <w:pStyle w:val="ListParagraph"/>
+        <w:numPr>
+          <w:ilvl w:val="1"/>
+          <w:numId w:val="1"/>
+        </w:numPr>
+      </w:pPr>
+      <w:r>
+        <w:t>They’re one-way, meaning you can phase thru them but if you jump on them, you’ll remain on top</w:t>
+      </w:r>
+    </w:p>
+    <w:p>
+      <w:pPr>
+        <w:pStyle w:val="ListParagraph"/>
+        <w:numPr>
+          <w:ilvl w:val="1"/>
+          <w:numId w:val="1"/>
+        </w:numPr>
+      </w:pPr>
+      <w:r>
+        <w:t>Basically mario style</w:t>
+      </w:r>
+    </w:p>
+    <w:p>
+      <w:pPr>
+        <w:pStyle w:val="ListParagraph"/>
+        <w:numPr>
+          <w:ilvl w:val="0"/>
+          <w:numId w:val="1"/>
+        </w:numPr>
+      </w:pPr>
+      <w:r>
+        <w:t xml:space="preserve">Created </w:t>
+      </w:r>
+      <w:r>
+        <w:t xml:space="preserve">a </w:t>
+      </w:r>
+      <w:r>
+        <w:t xml:space="preserve">basic </w:t>
+      </w:r>
+      <w:r>
+        <w:t>E</w:t>
+      </w:r>
+      <w:r>
+        <w:t xml:space="preserve">nemy </w:t>
+      </w:r>
+      <w:r>
+        <w:t>class</w:t>
+      </w:r>
+    </w:p>
+    <w:p>
+      <w:pPr>
+        <w:pStyle w:val="ListParagraph"/>
+        <w:numPr>
+          <w:ilvl w:val="0"/>
+          <w:numId w:val="1"/>
+        </w:numPr>
+      </w:pPr>
+      <w:r>
+        <w:t>Created a</w:t>
+      </w:r>
+      <w:r>
+        <w:t>n enemy called Roofus</w:t>
+      </w:r>
+    </w:p>
+    <w:p>
+      <w:r>
+        <w:t>Problems</w:t>
+      </w:r>
+    </w:p>
+    <w:p>
+      <w:pPr>
+        <w:pStyle w:val="ListParagraph"/>
+        <w:numPr>
+          <w:ilvl w:val="0"/>
+          <w:numId w:val="1"/>
+        </w:numPr>
+      </w:pPr>
+      <w:r>
+        <w:t>None</w:t>
+      </w:r>
+    </w:p>
+    <w:p>
+      <w:r>
         <w:lastRenderedPageBreak/>
-        <w:t>Day 7 – Nov. 20, 2025</w:t>
-      </w:r>
-    </w:p>
-    <w:p>
-      <w:r>
-        <w:t>What I worked on</w:t>
-      </w:r>
-    </w:p>
-    <w:p>
-      <w:pPr>
-        <w:pStyle w:val="ListParagraph"/>
-        <w:numPr>
-          <w:ilvl w:val="0"/>
-          <w:numId w:val="1"/>
-        </w:numPr>
-      </w:pPr>
-      <w:r>
-        <w:t>Made platforms work</w:t>
-      </w:r>
-    </w:p>
-    <w:p>
-      <w:pPr>
-        <w:pStyle w:val="ListParagraph"/>
-        <w:numPr>
-          <w:ilvl w:val="1"/>
-          <w:numId w:val="1"/>
-        </w:numPr>
-      </w:pPr>
-      <w:r>
-        <w:t>They’re one-way, meaning you can phase thru them but if you jump on them, you’ll remain on top</w:t>
-      </w:r>
-    </w:p>
-    <w:p>
-      <w:pPr>
-        <w:pStyle w:val="ListParagraph"/>
-        <w:numPr>
-          <w:ilvl w:val="1"/>
-          <w:numId w:val="1"/>
-        </w:numPr>
-      </w:pPr>
-      <w:r>
-        <w:t>Basically mario style</w:t>
-      </w:r>
-    </w:p>
-    <w:p>
-      <w:pPr>
-        <w:pStyle w:val="ListParagraph"/>
-        <w:numPr>
-          <w:ilvl w:val="0"/>
-          <w:numId w:val="1"/>
-        </w:numPr>
-      </w:pPr>
-      <w:r>
-        <w:t>Created basic enemy scaffolding</w:t>
-      </w:r>
-    </w:p>
-    <w:p>
-      <w:pPr>
-        <w:pStyle w:val="ListParagraph"/>
-        <w:numPr>
-          <w:ilvl w:val="1"/>
-          <w:numId w:val="1"/>
-        </w:numPr>
-      </w:pPr>
-      <w:r>
-        <w:t>Added an enemy called Roofus</w:t>
-      </w:r>
-    </w:p>
-    <w:p>
-      <w:r>
-        <w:t>Problems</w:t>
-      </w:r>
-    </w:p>
-    <w:p>
-      <w:pPr>
-        <w:pStyle w:val="ListParagraph"/>
-        <w:numPr>
-          <w:ilvl w:val="0"/>
-          <w:numId w:val="1"/>
-        </w:numPr>
-      </w:pPr>
-      <w:r>
-        <w:t>None</w:t>
-      </w:r>
-    </w:p>
-    <w:p>
-      <w:r>
         <w:t>Next class</w:t>
       </w:r>
     </w:p>
@@ -2949,19 +3388,37 @@
         </w:numPr>
       </w:pPr>
       <w:r>
-        <w:t>Added weapons like knife that enemies and players can wield and use</w:t>
-      </w:r>
-    </w:p>
-    <w:p>
-      <w:pPr>
-        <w:pStyle w:val="ListParagraph"/>
-        <w:numPr>
-          <w:ilvl w:val="0"/>
-          <w:numId w:val="1"/>
-        </w:numPr>
-      </w:pPr>
-      <w:r>
-        <w:t>Added HP for all enemies</w:t>
+        <w:t>Created a Weapon class</w:t>
+      </w:r>
+    </w:p>
+    <w:p>
+      <w:pPr>
+        <w:pStyle w:val="ListParagraph"/>
+        <w:numPr>
+          <w:ilvl w:val="1"/>
+          <w:numId w:val="1"/>
+        </w:numPr>
+      </w:pPr>
+      <w:r>
+        <w:t>Created</w:t>
+      </w:r>
+      <w:r>
+        <w:t xml:space="preserve"> weapons like knife that enemies and players can wield and use</w:t>
+      </w:r>
+    </w:p>
+    <w:p>
+      <w:pPr>
+        <w:pStyle w:val="ListParagraph"/>
+        <w:numPr>
+          <w:ilvl w:val="0"/>
+          <w:numId w:val="1"/>
+        </w:numPr>
+      </w:pPr>
+      <w:r>
+        <w:t xml:space="preserve">Added HP for all </w:t>
+      </w:r>
+      <w:r>
+        <w:t>entities</w:t>
       </w:r>
     </w:p>
     <w:p>
@@ -2985,7 +3442,7 @@
         </w:numPr>
       </w:pPr>
       <w:r>
-        <w:t>Added a game over screen</w:t>
+        <w:t>Added a gameover screen</w:t>
       </w:r>
     </w:p>
     <w:p>
@@ -3049,7 +3506,6 @@
           <w:bCs/>
           <w:u w:val="single"/>
         </w:rPr>
-        <w:lastRenderedPageBreak/>
         <w:t>Day 9 – Nov. 26, 2025</w:t>
       </w:r>
     </w:p>
@@ -3139,29 +3595,68 @@
       <w:r>
         <w:t>Added an item menu</w:t>
       </w:r>
-    </w:p>
-    <w:p>
-      <w:pPr>
-        <w:pStyle w:val="ListParagraph"/>
-        <w:numPr>
-          <w:ilvl w:val="0"/>
-          <w:numId w:val="1"/>
-        </w:numPr>
-      </w:pPr>
-      <w:r>
-        <w:t>Created a disfunctional gun and bullet system</w:t>
-      </w:r>
-    </w:p>
-    <w:p>
-      <w:pPr>
-        <w:pStyle w:val="ListParagraph"/>
-        <w:numPr>
-          <w:ilvl w:val="0"/>
-          <w:numId w:val="1"/>
-        </w:numPr>
-      </w:pPr>
-      <w:r>
-        <w:t>Made terrain vary in height!!</w:t>
+      <w:r>
+        <w:t xml:space="preserve"> that can be used with the keyboard numbers 1 through 5</w:t>
+      </w:r>
+    </w:p>
+    <w:p>
+      <w:pPr>
+        <w:pStyle w:val="ListParagraph"/>
+        <w:numPr>
+          <w:ilvl w:val="0"/>
+          <w:numId w:val="1"/>
+        </w:numPr>
+      </w:pPr>
+      <w:r>
+        <w:t xml:space="preserve">Created a disfunctional </w:t>
+      </w:r>
+      <w:r>
+        <w:t>G</w:t>
+      </w:r>
+      <w:r>
+        <w:t>un</w:t>
+      </w:r>
+      <w:r>
+        <w:t xml:space="preserve"> class</w:t>
+      </w:r>
+      <w:r>
+        <w:t xml:space="preserve"> and </w:t>
+      </w:r>
+      <w:r>
+        <w:t>B</w:t>
+      </w:r>
+      <w:r>
+        <w:t xml:space="preserve">ullet </w:t>
+      </w:r>
+      <w:r>
+        <w:t>class</w:t>
+      </w:r>
+    </w:p>
+    <w:p>
+      <w:pPr>
+        <w:pStyle w:val="ListParagraph"/>
+        <w:numPr>
+          <w:ilvl w:val="0"/>
+          <w:numId w:val="1"/>
+        </w:numPr>
+      </w:pPr>
+      <w:r>
+        <w:t xml:space="preserve">The </w:t>
+      </w:r>
+      <w:r>
+        <w:t>terrain</w:t>
+      </w:r>
+      <w:r>
+        <w:t xml:space="preserve"> now</w:t>
+      </w:r>
+      <w:r>
+        <w:t xml:space="preserve"> var</w:t>
+      </w:r>
+      <w:r>
+        <w:t>ies</w:t>
+      </w:r>
+      <w:r>
+        <w:t xml:space="preserve"> in height!!</w:t>
       </w:r>
     </w:p>
     <w:p>
@@ -3173,7 +3668,31 @@
         </w:numPr>
       </w:pPr>
       <w:r>
-        <w:t>It generates random heights in multiples of 40</w:t>
+        <w:t>This works by picking a number from a set of {-1, 0, 1} and multiplying it by the BLOCK_UNIT which is 40.</w:t>
+      </w:r>
+    </w:p>
+    <w:p>
+      <w:pPr>
+        <w:pStyle w:val="ListParagraph"/>
+        <w:numPr>
+          <w:ilvl w:val="1"/>
+          <w:numId w:val="1"/>
+        </w:numPr>
+      </w:pPr>
+      <w:r>
+        <w:t>If the height goes over a certain amount, there will only be the option of decreasing or remaining at the same height {-1, 0}</w:t>
+      </w:r>
+    </w:p>
+    <w:p>
+      <w:pPr>
+        <w:pStyle w:val="ListParagraph"/>
+        <w:numPr>
+          <w:ilvl w:val="2"/>
+          <w:numId w:val="1"/>
+        </w:numPr>
+      </w:pPr>
+      <w:r>
+        <w:t>Same for if the height goes below a certain amount</w:t>
       </w:r>
     </w:p>
     <w:p>
@@ -3243,6 +3762,7 @@
         </w:numPr>
       </w:pPr>
       <w:r>
+        <w:lastRenderedPageBreak/>
         <w:t>Work on procedural generation of platforms</w:t>
       </w:r>
     </w:p>
@@ -3263,7 +3783,6 @@
           <w:bCs/>
           <w:u w:val="single"/>
         </w:rPr>
-        <w:lastRenderedPageBreak/>
         <w:t>Day 10 – Dec. 2, 2025 (IT’S DECEMBER!!!!!!!!!)</w:t>
       </w:r>
     </w:p>
@@ -3336,6 +3855,18 @@
       <w:pPr>
         <w:pStyle w:val="ListParagraph"/>
         <w:numPr>
+          <w:ilvl w:val="1"/>
+          <w:numId w:val="1"/>
+        </w:numPr>
+      </w:pPr>
+      <w:r>
+        <w:t>A chunking system, frozen chunks, and displayed chunks</w:t>
+      </w:r>
+    </w:p>
+    <w:p>
+      <w:pPr>
+        <w:pStyle w:val="ListParagraph"/>
+        <w:numPr>
           <w:ilvl w:val="0"/>
           <w:numId w:val="1"/>
         </w:numPr>
@@ -3348,36 +3879,416 @@
       <w:pPr>
         <w:pStyle w:val="ListParagraph"/>
         <w:numPr>
-          <w:ilvl w:val="0"/>
-          <w:numId w:val="1"/>
-        </w:numPr>
-      </w:pPr>
-      <w:r>
-        <w:t>An ‘upside down’ that you can flip to</w:t>
-      </w:r>
-    </w:p>
-    <w:p>
-      <w:pPr>
-        <w:pStyle w:val="ListParagraph"/>
-        <w:numPr>
-          <w:ilvl w:val="0"/>
-          <w:numId w:val="1"/>
-        </w:numPr>
-      </w:pPr>
-      <w:r>
-        <w:t>Fall damage</w:t>
-      </w:r>
-    </w:p>
-    <w:p>
-      <w:pPr>
-        <w:pStyle w:val="ListParagraph"/>
-        <w:numPr>
-          <w:ilvl w:val="0"/>
-          <w:numId w:val="1"/>
-        </w:numPr>
-      </w:pPr>
-      <w:r>
-        <w:t>Trampolines that you should be able to boost yourself with</w:t>
+          <w:ilvl w:val="1"/>
+          <w:numId w:val="1"/>
+        </w:numPr>
+      </w:pPr>
+      <w:r>
+        <w:t>The Environment class is responsible for this. I created a glow() method that takes in a RectBody among other parameters and makes it glow for one frame (it’s called every frame in the update loop).</w:t>
+      </w:r>
+    </w:p>
+    <w:p>
+      <w:pPr>
+        <w:pStyle w:val="ListParagraph"/>
+        <w:numPr>
+          <w:ilvl w:val="1"/>
+          <w:numId w:val="1"/>
+        </w:numPr>
+      </w:pPr>
+      <w:r>
+        <w:t xml:space="preserve">I’m very proud of this effect, so here’s an in-depth explanation of how I did it </w:t>
+      </w:r>
+      <w:r>
+        <w:rPr>
+          <w:rFonts w:ascii="Apple Color Emoji" w:hAnsi="Apple Color Emoji" w:cs="Apple Color Emoji"/>
+        </w:rPr>
+        <w:t>🤣</w:t>
+      </w:r>
+      <w:r>
+        <w:rPr>
+          <w:rFonts w:ascii="Cambria" w:hAnsi="Cambria" w:cs="Apple Color Emoji"/>
+        </w:rPr>
+        <w:t xml:space="preserve">. </w:t>
+      </w:r>
+      <w:r>
+        <w:t>To achieve this effect, I created two PGraphics variables: lightMask and darknessFilter:</w:t>
+      </w:r>
+    </w:p>
+    <w:p>
+      <w:pPr>
+        <w:pStyle w:val="ListParagraph"/>
+        <w:ind w:left="1440"/>
+      </w:pPr>
+      <w:r>
+        <w:rPr>
+          <w:noProof/>
+        </w:rPr>
+        <w:lastRenderedPageBreak/>
+        <w:drawing>
+          <wp:inline distT="0" distB="0" distL="0" distR="0" wp14:anchorId="3FC4EF27" wp14:editId="084253B7">
+            <wp:extent cx="3835400" cy="647700"/>
+            <wp:effectExtent l="0" t="0" r="0" b="0"/>
+            <wp:docPr id="807173745" name="Picture 1" descr="A close up of text&#10;&#10;AI-generated content may be incorrect."/>
+            <wp:cNvGraphicFramePr>
+              <a:graphicFrameLocks xmlns:a="http://schemas.openxmlformats.org/drawingml/2006/main" noChangeAspect="1"/>
+            </wp:cNvGraphicFramePr>
+            <a:graphic xmlns:a="http://schemas.openxmlformats.org/drawingml/2006/main">
+              <a:graphicData uri="http://schemas.openxmlformats.org/drawingml/2006/picture">
+                <pic:pic xmlns:pic="http://schemas.openxmlformats.org/drawingml/2006/picture">
+                  <pic:nvPicPr>
+                    <pic:cNvPr id="807173745" name="Picture 1" descr="A close up of text&#10;&#10;AI-generated content may be incorrect."/>
+                    <pic:cNvPicPr/>
+                  </pic:nvPicPr>
+                  <pic:blipFill>
+                    <a:blip r:embed="rId11">
+                      <a:extLst>
+                        <a:ext uri="{28A0092B-C50C-407E-A947-70E740481C1C}">
+                          <a14:useLocalDpi xmlns:a14="http://schemas.microsoft.com/office/drawing/2010/main" val="0"/>
+                        </a:ext>
+                      </a:extLst>
+                    </a:blip>
+                    <a:stretch>
+                      <a:fillRect/>
+                    </a:stretch>
+                  </pic:blipFill>
+                  <pic:spPr>
+                    <a:xfrm>
+                      <a:off x="0" y="0"/>
+                      <a:ext cx="3835400" cy="647700"/>
+                    </a:xfrm>
+                    <a:prstGeom prst="rect">
+                      <a:avLst/>
+                    </a:prstGeom>
+                  </pic:spPr>
+                </pic:pic>
+              </a:graphicData>
+            </a:graphic>
+          </wp:inline>
+        </w:drawing>
+      </w:r>
+    </w:p>
+    <w:p>
+      <w:pPr>
+        <w:pStyle w:val="ListParagraph"/>
+        <w:numPr>
+          <w:ilvl w:val="1"/>
+          <w:numId w:val="1"/>
+        </w:numPr>
+      </w:pPr>
+      <w:r>
+        <w:t xml:space="preserve">Then, in Environment’s update loop, I fill the lightMask with a background of 0-255, where 0 is complete brightness and 255 is complete darkness </w:t>
+      </w:r>
+      <w:r>
+        <w:rPr>
+          <w:i/>
+          <w:iCs/>
+        </w:rPr>
+        <w:t>(it’s inverted because the darkness filter will be filled black. Applying a mask to a PGraphic works by using  the grayscale value as the alpha for each pixel. This means a grayscale of 0 means that the black will have an alpha of 0, or in otherwords, it’s transparent, thus representing daytime. A grayscale of 255 means that the black will have an alpha of 255, meaning it would be complete darkness, and nothing will be seen.)</w:t>
+      </w:r>
+      <w:r>
+        <w:br/>
+      </w:r>
+      <w:r>
+        <w:rPr>
+          <w:noProof/>
+        </w:rPr>
+        <w:drawing>
+          <wp:inline distT="0" distB="0" distL="0" distR="0" wp14:anchorId="384839D1" wp14:editId="4433D886">
+            <wp:extent cx="3471435" cy="1047735"/>
+            <wp:effectExtent l="0" t="0" r="0" b="0"/>
+            <wp:docPr id="2125497411" name="Picture 2" descr="A computer screen with text&#10;&#10;AI-generated content may be incorrect."/>
+            <wp:cNvGraphicFramePr>
+              <a:graphicFrameLocks xmlns:a="http://schemas.openxmlformats.org/drawingml/2006/main" noChangeAspect="1"/>
+            </wp:cNvGraphicFramePr>
+            <a:graphic xmlns:a="http://schemas.openxmlformats.org/drawingml/2006/main">
+              <a:graphicData uri="http://schemas.openxmlformats.org/drawingml/2006/picture">
+                <pic:pic xmlns:pic="http://schemas.openxmlformats.org/drawingml/2006/picture">
+                  <pic:nvPicPr>
+                    <pic:cNvPr id="2125497411" name="Picture 2" descr="A computer screen with text&#10;&#10;AI-generated content may be incorrect."/>
+                    <pic:cNvPicPr/>
+                  </pic:nvPicPr>
+                  <pic:blipFill>
+                    <a:blip r:embed="rId12" cstate="print">
+                      <a:extLst>
+                        <a:ext uri="{28A0092B-C50C-407E-A947-70E740481C1C}">
+                          <a14:useLocalDpi xmlns:a14="http://schemas.microsoft.com/office/drawing/2010/main" val="0"/>
+                        </a:ext>
+                      </a:extLst>
+                    </a:blip>
+                    <a:stretch>
+                      <a:fillRect/>
+                    </a:stretch>
+                  </pic:blipFill>
+                  <pic:spPr>
+                    <a:xfrm>
+                      <a:off x="0" y="0"/>
+                      <a:ext cx="3547636" cy="1070734"/>
+                    </a:xfrm>
+                    <a:prstGeom prst="rect">
+                      <a:avLst/>
+                    </a:prstGeom>
+                  </pic:spPr>
+                </pic:pic>
+              </a:graphicData>
+            </a:graphic>
+          </wp:inline>
+        </w:drawing>
+      </w:r>
+    </w:p>
+    <w:p>
+      <w:pPr>
+        <w:pStyle w:val="ListParagraph"/>
+        <w:numPr>
+          <w:ilvl w:val="1"/>
+          <w:numId w:val="1"/>
+        </w:numPr>
+      </w:pPr>
+      <w:r>
+        <w:rPr>
+          <w:noProof/>
+        </w:rPr>
+        <w:drawing>
+          <wp:inline distT="0" distB="0" distL="0" distR="0" wp14:anchorId="04ED331C" wp14:editId="66A4328A">
+            <wp:extent cx="3470910" cy="1996144"/>
+            <wp:effectExtent l="0" t="0" r="0" b="0"/>
+            <wp:docPr id="1303238710" name="Picture 3" descr="A computer screen shot of code&#10;&#10;AI-generated content may be incorrect."/>
+            <wp:cNvGraphicFramePr>
+              <a:graphicFrameLocks xmlns:a="http://schemas.openxmlformats.org/drawingml/2006/main" noChangeAspect="1"/>
+            </wp:cNvGraphicFramePr>
+            <a:graphic xmlns:a="http://schemas.openxmlformats.org/drawingml/2006/main">
+              <a:graphicData uri="http://schemas.openxmlformats.org/drawingml/2006/picture">
+                <pic:pic xmlns:pic="http://schemas.openxmlformats.org/drawingml/2006/picture">
+                  <pic:nvPicPr>
+                    <pic:cNvPr id="1303238710" name="Picture 3" descr="A computer screen shot of code&#10;&#10;AI-generated content may be incorrect."/>
+                    <pic:cNvPicPr/>
+                  </pic:nvPicPr>
+                  <pic:blipFill>
+                    <a:blip r:embed="rId13" cstate="print">
+                      <a:extLst>
+                        <a:ext uri="{28A0092B-C50C-407E-A947-70E740481C1C}">
+                          <a14:useLocalDpi xmlns:a14="http://schemas.microsoft.com/office/drawing/2010/main" val="0"/>
+                        </a:ext>
+                      </a:extLst>
+                    </a:blip>
+                    <a:stretch>
+                      <a:fillRect/>
+                    </a:stretch>
+                  </pic:blipFill>
+                  <pic:spPr>
+                    <a:xfrm>
+                      <a:off x="0" y="0"/>
+                      <a:ext cx="3507412" cy="2017137"/>
+                    </a:xfrm>
+                    <a:prstGeom prst="rect">
+                      <a:avLst/>
+                    </a:prstGeom>
+                  </pic:spPr>
+                </pic:pic>
+              </a:graphicData>
+            </a:graphic>
+          </wp:inline>
+        </w:drawing>
+      </w:r>
+    </w:p>
+    <w:p>
+      <w:pPr>
+        <w:pStyle w:val="ListParagraph"/>
+        <w:numPr>
+          <w:ilvl w:val="1"/>
+          <w:numId w:val="1"/>
+        </w:numPr>
+      </w:pPr>
+      <w:r>
+        <w:t>Then, in glow() concentric circles are drawn onto lightMask where the center of the RectBody target has a grayscale value of 255, or white, meaning this is the center of complete brightness. Th</w:t>
+      </w:r>
+      <w:r>
+        <w:t xml:space="preserve">e grayscale value decreases </w:t>
+      </w:r>
+      <w:r>
+        <w:t>as it gets away from</w:t>
+      </w:r>
+      <w:r>
+        <w:t xml:space="preserve"> the center, creating a glow effect.</w:t>
+      </w:r>
+      <w:r>
+        <w:br/>
+      </w:r>
+      <w:r>
+        <w:rPr>
+          <w:noProof/>
+        </w:rPr>
+        <w:drawing>
+          <wp:inline distT="0" distB="0" distL="0" distR="0" wp14:anchorId="6009CA55" wp14:editId="73AB7566">
+            <wp:extent cx="1942220" cy="1653585"/>
+            <wp:effectExtent l="0" t="0" r="1270" b="0"/>
+            <wp:docPr id="1233546630" name="Picture 4" descr="A computer screen shot of text&#10;&#10;AI-generated content may be incorrect."/>
+            <wp:cNvGraphicFramePr>
+              <a:graphicFrameLocks xmlns:a="http://schemas.openxmlformats.org/drawingml/2006/main" noChangeAspect="1"/>
+            </wp:cNvGraphicFramePr>
+            <a:graphic xmlns:a="http://schemas.openxmlformats.org/drawingml/2006/main">
+              <a:graphicData uri="http://schemas.openxmlformats.org/drawingml/2006/picture">
+                <pic:pic xmlns:pic="http://schemas.openxmlformats.org/drawingml/2006/picture">
+                  <pic:nvPicPr>
+                    <pic:cNvPr id="1233546630" name="Picture 4" descr="A computer screen shot of text&#10;&#10;AI-generated content may be incorrect."/>
+                    <pic:cNvPicPr/>
+                  </pic:nvPicPr>
+                  <pic:blipFill>
+                    <a:blip r:embed="rId14" cstate="print">
+                      <a:extLst>
+                        <a:ext uri="{28A0092B-C50C-407E-A947-70E740481C1C}">
+                          <a14:useLocalDpi xmlns:a14="http://schemas.microsoft.com/office/drawing/2010/main" val="0"/>
+                        </a:ext>
+                      </a:extLst>
+                    </a:blip>
+                    <a:stretch>
+                      <a:fillRect/>
+                    </a:stretch>
+                  </pic:blipFill>
+                  <pic:spPr>
+                    <a:xfrm>
+                      <a:off x="0" y="0"/>
+                      <a:ext cx="1959811" cy="1668561"/>
+                    </a:xfrm>
+                    <a:prstGeom prst="rect">
+                      <a:avLst/>
+                    </a:prstGeom>
+                  </pic:spPr>
+                </pic:pic>
+              </a:graphicData>
+            </a:graphic>
+          </wp:inline>
+        </w:drawing>
+      </w:r>
+    </w:p>
+    <w:p>
+      <w:pPr>
+        <w:pStyle w:val="ListParagraph"/>
+        <w:numPr>
+          <w:ilvl w:val="1"/>
+          <w:numId w:val="1"/>
+        </w:numPr>
+      </w:pPr>
+      <w:r>
+        <w:lastRenderedPageBreak/>
+        <w:t>Finally, in displayFilter(), the lightMask is applied to darknessFilter and drawn onto screen.</w:t>
+      </w:r>
+    </w:p>
+    <w:p>
+      <w:pPr>
+        <w:pStyle w:val="ListParagraph"/>
+        <w:numPr>
+          <w:ilvl w:val="1"/>
+          <w:numId w:val="1"/>
+        </w:numPr>
+      </w:pPr>
+      <w:r>
+        <w:rPr>
+          <w:noProof/>
+        </w:rPr>
+        <w:drawing>
+          <wp:inline distT="0" distB="0" distL="0" distR="0" wp14:anchorId="775014A4" wp14:editId="5ABDB9CB">
+            <wp:extent cx="5105400" cy="2616200"/>
+            <wp:effectExtent l="0" t="0" r="0" b="0"/>
+            <wp:docPr id="1541298462" name="Picture 5" descr="A screen shot of a computer code&#10;&#10;AI-generated content may be incorrect."/>
+            <wp:cNvGraphicFramePr>
+              <a:graphicFrameLocks xmlns:a="http://schemas.openxmlformats.org/drawingml/2006/main" noChangeAspect="1"/>
+            </wp:cNvGraphicFramePr>
+            <a:graphic xmlns:a="http://schemas.openxmlformats.org/drawingml/2006/main">
+              <a:graphicData uri="http://schemas.openxmlformats.org/drawingml/2006/picture">
+                <pic:pic xmlns:pic="http://schemas.openxmlformats.org/drawingml/2006/picture">
+                  <pic:nvPicPr>
+                    <pic:cNvPr id="1541298462" name="Picture 5" descr="A screen shot of a computer code&#10;&#10;AI-generated content may be incorrect."/>
+                    <pic:cNvPicPr/>
+                  </pic:nvPicPr>
+                  <pic:blipFill>
+                    <a:blip r:embed="rId15">
+                      <a:extLst>
+                        <a:ext uri="{28A0092B-C50C-407E-A947-70E740481C1C}">
+                          <a14:useLocalDpi xmlns:a14="http://schemas.microsoft.com/office/drawing/2010/main" val="0"/>
+                        </a:ext>
+                      </a:extLst>
+                    </a:blip>
+                    <a:stretch>
+                      <a:fillRect/>
+                    </a:stretch>
+                  </pic:blipFill>
+                  <pic:spPr>
+                    <a:xfrm>
+                      <a:off x="0" y="0"/>
+                      <a:ext cx="5105400" cy="2616200"/>
+                    </a:xfrm>
+                    <a:prstGeom prst="rect">
+                      <a:avLst/>
+                    </a:prstGeom>
+                  </pic:spPr>
+                </pic:pic>
+              </a:graphicData>
+            </a:graphic>
+          </wp:inline>
+        </w:drawing>
+      </w:r>
+    </w:p>
+    <w:p>
+      <w:pPr>
+        <w:pStyle w:val="ListParagraph"/>
+        <w:numPr>
+          <w:ilvl w:val="0"/>
+          <w:numId w:val="1"/>
+        </w:numPr>
+      </w:pPr>
+      <w:r>
+        <w:t>There is now a</w:t>
+      </w:r>
+      <w:r>
+        <w:t>n ‘upside down’ that you can flip to</w:t>
+      </w:r>
+    </w:p>
+    <w:p>
+      <w:pPr>
+        <w:pStyle w:val="ListParagraph"/>
+        <w:numPr>
+          <w:ilvl w:val="1"/>
+          <w:numId w:val="1"/>
+        </w:numPr>
+      </w:pPr>
+      <w:r>
+        <w:t>This was a MAJOR change. There is now a rightsideUp terrain and an upsideDown terrain, all entities can now be either rightsideUp or upsideDown, and platform collisions had to be modified.</w:t>
+      </w:r>
+    </w:p>
+    <w:p>
+      <w:pPr>
+        <w:pStyle w:val="ListParagraph"/>
+        <w:numPr>
+          <w:ilvl w:val="0"/>
+          <w:numId w:val="1"/>
+        </w:numPr>
+      </w:pPr>
+      <w:r>
+        <w:t>To make sure the player doesn’t flip to avoid enemies, there’s severe f</w:t>
+      </w:r>
+      <w:r>
+        <w:t>all damage</w:t>
+      </w:r>
+      <w:r>
+        <w:t xml:space="preserve"> when the player flips</w:t>
+      </w:r>
+    </w:p>
+    <w:p>
+      <w:pPr>
+        <w:pStyle w:val="ListParagraph"/>
+        <w:numPr>
+          <w:ilvl w:val="1"/>
+          <w:numId w:val="1"/>
+        </w:numPr>
+      </w:pPr>
+      <w:r>
+        <w:t>Unless, the user falls on a T</w:t>
+      </w:r>
+      <w:r>
+        <w:t>rampoline</w:t>
+      </w:r>
+      <w:r>
+        <w:t xml:space="preserve"> (subclass of the Platform class)</w:t>
       </w:r>
     </w:p>
     <w:p>
@@ -3394,10 +4305,7 @@
     </w:p>
     <w:p>
       <w:r>
-        <w:t>Minor p</w:t>
-      </w:r>
-      <w:r>
-        <w:t>roblems</w:t>
+        <w:t>Minor problems</w:t>
       </w:r>
     </w:p>
     <w:p>
@@ -3443,35 +4351,366 @@
         </w:numPr>
       </w:pPr>
       <w:r>
+        <w:t>Add ‘flags’ or collectables. 15 to win or something similar</w:t>
+      </w:r>
+    </w:p>
+    <w:p>
+      <w:pPr>
+        <w:pStyle w:val="ListParagraph"/>
+        <w:numPr>
+          <w:ilvl w:val="0"/>
+          <w:numId w:val="1"/>
+        </w:numPr>
+      </w:pPr>
+      <w:r>
+        <w:t>Work on procedural generation of platforms</w:t>
+      </w:r>
+    </w:p>
+    <w:p>
+      <w:pPr>
+        <w:pStyle w:val="ListParagraph"/>
+        <w:numPr>
+          <w:ilvl w:val="0"/>
+          <w:numId w:val="1"/>
+        </w:numPr>
+      </w:pPr>
+      <w:r>
+        <w:t>Fix trampolines</w:t>
+      </w:r>
+    </w:p>
+    <w:p>
+      <w:pPr>
+        <w:rPr>
+          <w:b/>
+          <w:bCs/>
+          <w:u w:val="single"/>
+        </w:rPr>
+      </w:pPr>
+      <w:r>
+        <w:rPr>
+          <w:b/>
+          <w:bCs/>
+          <w:u w:val="single"/>
+        </w:rPr>
+        <w:t>Day 1</w:t>
+      </w:r>
+      <w:r>
+        <w:rPr>
+          <w:b/>
+          <w:bCs/>
+          <w:u w:val="single"/>
+        </w:rPr>
+        <w:t>1</w:t>
+      </w:r>
+      <w:r>
+        <w:rPr>
+          <w:b/>
+          <w:bCs/>
+          <w:u w:val="single"/>
+        </w:rPr>
+        <w:t xml:space="preserve"> – Dec. </w:t>
+      </w:r>
+      <w:r>
+        <w:rPr>
+          <w:b/>
+          <w:bCs/>
+          <w:u w:val="single"/>
+        </w:rPr>
+        <w:t>4</w:t>
+      </w:r>
+      <w:r>
+        <w:rPr>
+          <w:b/>
+          <w:bCs/>
+          <w:u w:val="single"/>
+        </w:rPr>
+        <w:t>, 2025</w:t>
+      </w:r>
+      <w:r>
+        <w:rPr>
+          <w:b/>
+          <w:bCs/>
+          <w:u w:val="single"/>
+        </w:rPr>
+        <w:t xml:space="preserve"> (T-21 days)</w:t>
+      </w:r>
+    </w:p>
+    <w:p>
+      <w:r>
+        <w:t>What I worked on</w:t>
+      </w:r>
+    </w:p>
+    <w:p>
+      <w:pPr>
+        <w:pStyle w:val="ListParagraph"/>
+        <w:numPr>
+          <w:ilvl w:val="0"/>
+          <w:numId w:val="1"/>
+        </w:numPr>
+      </w:pPr>
+      <w:r>
         <w:lastRenderedPageBreak/>
-        <w:t>Add ‘flags’ or collectables. 15 to win or something similar</w:t>
-      </w:r>
-    </w:p>
-    <w:p>
-      <w:pPr>
-        <w:pStyle w:val="ListParagraph"/>
-        <w:numPr>
-          <w:ilvl w:val="0"/>
-          <w:numId w:val="1"/>
-        </w:numPr>
-      </w:pPr>
-      <w:r>
-        <w:t>Work on procedural generation of platforms</w:t>
-      </w:r>
-    </w:p>
-    <w:p>
-      <w:pPr>
-        <w:pStyle w:val="ListParagraph"/>
-        <w:numPr>
-          <w:ilvl w:val="0"/>
-          <w:numId w:val="1"/>
-        </w:numPr>
-      </w:pPr>
-      <w:r>
-        <w:t>Fix trampolines</w:t>
-      </w:r>
-    </w:p>
-    <w:p/>
+        <w:t>Fixed trampolines and make them procedurally generate</w:t>
+      </w:r>
+    </w:p>
+    <w:p>
+      <w:pPr>
+        <w:pStyle w:val="ListParagraph"/>
+        <w:numPr>
+          <w:ilvl w:val="0"/>
+          <w:numId w:val="1"/>
+        </w:numPr>
+      </w:pPr>
+      <w:r>
+        <w:t>Added the ability for the Meeple to collect items</w:t>
+      </w:r>
+    </w:p>
+    <w:p>
+      <w:r>
+        <w:t>Major problems</w:t>
+      </w:r>
+    </w:p>
+    <w:p>
+      <w:pPr>
+        <w:pStyle w:val="ListParagraph"/>
+        <w:numPr>
+          <w:ilvl w:val="0"/>
+          <w:numId w:val="1"/>
+        </w:numPr>
+      </w:pPr>
+      <w:r>
+        <w:t>None</w:t>
+      </w:r>
+    </w:p>
+    <w:p>
+      <w:r>
+        <w:t>Next 2 classes</w:t>
+      </w:r>
+    </w:p>
+    <w:p>
+      <w:pPr>
+        <w:pStyle w:val="ListParagraph"/>
+        <w:numPr>
+          <w:ilvl w:val="0"/>
+          <w:numId w:val="1"/>
+        </w:numPr>
+      </w:pPr>
+      <w:r>
+        <w:t>Make flags procedurally generate</w:t>
+      </w:r>
+    </w:p>
+    <w:p>
+      <w:pPr>
+        <w:pStyle w:val="ListParagraph"/>
+        <w:numPr>
+          <w:ilvl w:val="0"/>
+          <w:numId w:val="1"/>
+        </w:numPr>
+      </w:pPr>
+      <w:r>
+        <w:t>Make different types of enemies</w:t>
+      </w:r>
+    </w:p>
+    <w:p>
+      <w:pPr>
+        <w:rPr>
+          <w:b/>
+          <w:bCs/>
+          <w:u w:val="single"/>
+        </w:rPr>
+      </w:pPr>
+      <w:r>
+        <w:rPr>
+          <w:b/>
+          <w:bCs/>
+          <w:u w:val="single"/>
+        </w:rPr>
+        <w:t>Day 12 – Dec. 8, 2025 (T-17 Days)</w:t>
+      </w:r>
+    </w:p>
+    <w:p>
+      <w:r>
+        <w:t>What I worked on</w:t>
+      </w:r>
+    </w:p>
+    <w:p>
+      <w:pPr>
+        <w:pStyle w:val="ListParagraph"/>
+        <w:numPr>
+          <w:ilvl w:val="0"/>
+          <w:numId w:val="1"/>
+        </w:numPr>
+      </w:pPr>
+      <w:r>
+        <w:t>Created an enemy</w:t>
+      </w:r>
+      <w:r>
+        <w:t xml:space="preserve"> that follows the player and begins a countdown before exploding</w:t>
+      </w:r>
+    </w:p>
+    <w:p>
+      <w:pPr>
+        <w:pStyle w:val="ListParagraph"/>
+        <w:numPr>
+          <w:ilvl w:val="1"/>
+          <w:numId w:val="1"/>
+        </w:numPr>
+      </w:pPr>
+      <w:r>
+        <w:t>Damage dealt is based on the player’s distance from the center of the enemy</w:t>
+      </w:r>
+    </w:p>
+    <w:p>
+      <w:pPr>
+        <w:pStyle w:val="ListParagraph"/>
+        <w:numPr>
+          <w:ilvl w:val="1"/>
+          <w:numId w:val="1"/>
+        </w:numPr>
+      </w:pPr>
+      <w:r>
+        <w:t>On explosion, the enemy dies</w:t>
+      </w:r>
+    </w:p>
+    <w:p>
+      <w:pPr>
+        <w:pStyle w:val="ListParagraph"/>
+        <w:numPr>
+          <w:ilvl w:val="0"/>
+          <w:numId w:val="1"/>
+        </w:numPr>
+      </w:pPr>
+      <w:r>
+        <w:t>Instead of just one type of enemy spawning, multiple types can now be spawned from a list of spawnableEnemies. Each have a random chance of occurring</w:t>
+      </w:r>
+    </w:p>
+    <w:p>
+      <w:pPr>
+        <w:pStyle w:val="ListParagraph"/>
+        <w:numPr>
+          <w:ilvl w:val="0"/>
+          <w:numId w:val="1"/>
+        </w:numPr>
+      </w:pPr>
+      <w:r>
+        <w:t>Enemies now randomly spawn not just in the rightside up but also the upside down</w:t>
+      </w:r>
+    </w:p>
+    <w:p>
+      <w:pPr>
+        <w:pStyle w:val="ListParagraph"/>
+        <w:numPr>
+          <w:ilvl w:val="0"/>
+          <w:numId w:val="1"/>
+        </w:numPr>
+      </w:pPr>
+      <w:r>
+        <w:t>Flags now procedurally generate</w:t>
+      </w:r>
+    </w:p>
+    <w:p>
+      <w:r>
+        <w:t>Major problems</w:t>
+      </w:r>
+    </w:p>
+    <w:p>
+      <w:pPr>
+        <w:pStyle w:val="ListParagraph"/>
+        <w:numPr>
+          <w:ilvl w:val="0"/>
+          <w:numId w:val="1"/>
+        </w:numPr>
+      </w:pPr>
+      <w:r>
+        <w:t>None</w:t>
+      </w:r>
+    </w:p>
+    <w:p>
+      <w:r>
+        <w:t>Next class</w:t>
+      </w:r>
+    </w:p>
+    <w:p>
+      <w:pPr>
+        <w:pStyle w:val="ListParagraph"/>
+        <w:numPr>
+          <w:ilvl w:val="0"/>
+          <w:numId w:val="1"/>
+        </w:numPr>
+      </w:pPr>
+      <w:r>
+        <w:t>Make 2 types of flags: upside down and rightside up ones?</w:t>
+      </w:r>
+    </w:p>
+    <w:p>
+      <w:pPr>
+        <w:pStyle w:val="ListParagraph"/>
+        <w:numPr>
+          <w:ilvl w:val="1"/>
+          <w:numId w:val="1"/>
+        </w:numPr>
+      </w:pPr>
+      <w:r>
+        <w:t xml:space="preserve"> </w:t>
+      </w:r>
+      <w:r>
+        <w:rPr>
+          <w:i/>
+          <w:iCs/>
+        </w:rPr>
+        <w:t>Or any other game mechanic that forces the player to travel between the two sides</w:t>
+      </w:r>
+    </w:p>
+    <w:p>
+      <w:pPr>
+        <w:pStyle w:val="ListParagraph"/>
+        <w:numPr>
+          <w:ilvl w:val="0"/>
+          <w:numId w:val="1"/>
+        </w:numPr>
+      </w:pPr>
+      <w:r>
+        <w:t>Make flag items stackable</w:t>
+      </w:r>
+    </w:p>
+    <w:p>
+      <w:pPr>
+        <w:pStyle w:val="ListParagraph"/>
+        <w:numPr>
+          <w:ilvl w:val="0"/>
+          <w:numId w:val="1"/>
+        </w:numPr>
+      </w:pPr>
+      <w:r>
+        <w:t>Add a win condition where the player collects some number of flags to win</w:t>
+      </w:r>
+    </w:p>
+    <w:p>
+      <w:pPr>
+        <w:rPr>
+          <w:b/>
+          <w:bCs/>
+          <w:u w:val="single"/>
+        </w:rPr>
+      </w:pPr>
+      <w:r>
+        <w:rPr>
+          <w:b/>
+          <w:bCs/>
+          <w:u w:val="single"/>
+        </w:rPr>
+        <w:t>Day 13 – Dec. 12, 2025 (T-13 Days)</w:t>
+      </w:r>
+    </w:p>
+    <w:p>
+      <w:r>
+        <w:t>PRESENTATIONS!</w:t>
+      </w:r>
+      <w:r>
+        <w:br/>
+        <w:t>Nothing got done today.</w:t>
+      </w:r>
+    </w:p>
     <w:sectPr>
       <w:type w:val="evenPage"/>
       <w:pgSz w:w="12240" w:h="15840"/>
@@ -3486,6 +4725,119 @@
 <file path=word/numbering.xml><?xml version="1.0" encoding="utf-8"?>
 <w:numbering xmlns:wpc="http://schemas.microsoft.com/office/word/2010/wordprocessingCanvas" xmlns:cx="http://schemas.microsoft.com/office/drawing/2014/chartex" xmlns:cx1="http://schemas.microsoft.com/office/drawing/2015/9/8/chartex" xmlns:cx2="http://schemas.microsoft.com/office/drawing/2015/10/21/chartex" xmlns:cx3="http://schemas.microsoft.com/office/drawing/2016/5/9/chartex" xmlns:cx4="http://schemas.microsoft.com/office/drawing/2016/5/10/chartex" xmlns:cx5="http://schemas.microsoft.com/office/drawing/2016/5/11/chartex" xmlns:cx6="http://schemas.microsoft.com/office/drawing/2016/5/12/chartex" xmlns:cx7="http://schemas.microsoft.com/office/drawing/2016/5/13/chartex" xmlns:cx8="http://schemas.microsoft.com/office/drawing/2016/5/14/chartex" xmlns:mc="http://schemas.openxmlformats.org/markup-compatibility/2006" xmlns:aink="http://schemas.microsoft.com/office/drawing/2016/ink" xmlns:am3d="http://schemas.microsoft.com/office/drawing/2017/model3d" xmlns:o="urn:schemas-microsoft-com:office:office" xmlns:oel="http://schemas.microsoft.com/office/2019/extlst" xmlns:r="http://schemas.openxmlformats.org/officeDocument/2006/relationships" xmlns:m="http://schemas.openxmlformats.org/officeDocument/2006/math" xmlns:v="urn:schemas-microsoft-com:vml" xmlns:wp14="http://schemas.microsoft.com/office/word/2010/wordprocessingDrawing" xmlns:wp="http://schemas.openxmlformats.org/drawingml/2006/wordprocessingDrawing" xmlns:w10="urn:schemas-microsoft-com:office:word" xmlns:w="http://schemas.openxmlformats.org/wordprocessingml/2006/main" xmlns:w14="http://schemas.microsoft.com/office/word/2010/wordml" xmlns:w15="http://schemas.microsoft.com/office/word/2012/wordml" xmlns:w16cex="http://schemas.microsoft.com/office/word/2018/wordml/cex" xmlns:w16cid="http://schemas.microsoft.com/office/word/2016/wordml/cid" xmlns:w16="http://schemas.microsoft.com/office/word/2018/wordml" xmlns:w16du="http://schemas.microsoft.com/office/word/2023/wordml/word16du" xmlns:w16sdtdh="http://schemas.microsoft.com/office/word/2020/wordml/sdtdatahash" xmlns:w16sdtfl="http://schemas.microsoft.com/office/word/2024/wordml/sdtformatlock" xmlns:w16se="http://schemas.microsoft.com/office/word/2015/wordml/symex" xmlns:wpg="http://schemas.microsoft.com/office/word/2010/wordprocessingGroup" xmlns:wpi="http://schemas.microsoft.com/office/word/2010/wordprocessingInk" xmlns:wne="http://schemas.microsoft.com/office/word/2006/wordml" xmlns:wps="http://schemas.microsoft.com/office/word/2010/wordprocessingShape" mc:Ignorable="w14 w15 w16se w16cid w16 w16cex w16sdtdh w16sdtfl w16du wp14">
   <w:abstractNum w:abstractNumId="0" w15:restartNumberingAfterBreak="0">
+    <w:nsid w:val="0EA51113"/>
+    <w:multiLevelType w:val="hybridMultilevel"/>
+    <w:tmpl w:val="953C98CA"/>
+    <w:lvl w:ilvl="0" w:tplc="04090001">
+      <w:start w:val="1"/>
+      <w:numFmt w:val="bullet"/>
+      <w:lvlText w:val=""/>
+      <w:lvlJc w:val="left"/>
+      <w:pPr>
+        <w:ind w:left="1080" w:hanging="360"/>
+      </w:pPr>
+      <w:rPr>
+        <w:rFonts w:ascii="Symbol" w:hAnsi="Symbol" w:hint="default"/>
+      </w:rPr>
+    </w:lvl>
+    <w:lvl w:ilvl="1" w:tplc="04090003" w:tentative="1">
+      <w:start w:val="1"/>
+      <w:numFmt w:val="bullet"/>
+      <w:lvlText w:val="o"/>
+      <w:lvlJc w:val="left"/>
+      <w:pPr>
+        <w:ind w:left="1800" w:hanging="360"/>
+      </w:pPr>
+      <w:rPr>
+        <w:rFonts w:ascii="Courier New" w:hAnsi="Courier New" w:cs="Courier New" w:hint="default"/>
+      </w:rPr>
+    </w:lvl>
+    <w:lvl w:ilvl="2" w:tplc="04090005" w:tentative="1">
+      <w:start w:val="1"/>
+      <w:numFmt w:val="bullet"/>
+      <w:lvlText w:val=""/>
+      <w:lvlJc w:val="left"/>
+      <w:pPr>
+        <w:ind w:left="2520" w:hanging="360"/>
+      </w:pPr>
+      <w:rPr>
+        <w:rFonts w:ascii="Wingdings" w:hAnsi="Wingdings" w:hint="default"/>
+      </w:rPr>
+    </w:lvl>
+    <w:lvl w:ilvl="3" w:tplc="04090001" w:tentative="1">
+      <w:start w:val="1"/>
+      <w:numFmt w:val="bullet"/>
+      <w:lvlText w:val=""/>
+      <w:lvlJc w:val="left"/>
+      <w:pPr>
+        <w:ind w:left="3240" w:hanging="360"/>
+      </w:pPr>
+      <w:rPr>
+        <w:rFonts w:ascii="Symbol" w:hAnsi="Symbol" w:hint="default"/>
+      </w:rPr>
+    </w:lvl>
+    <w:lvl w:ilvl="4" w:tplc="04090003" w:tentative="1">
+      <w:start w:val="1"/>
+      <w:numFmt w:val="bullet"/>
+      <w:lvlText w:val="o"/>
+      <w:lvlJc w:val="left"/>
+      <w:pPr>
+        <w:ind w:left="3960" w:hanging="360"/>
+      </w:pPr>
+      <w:rPr>
+        <w:rFonts w:ascii="Courier New" w:hAnsi="Courier New" w:cs="Courier New" w:hint="default"/>
+      </w:rPr>
+    </w:lvl>
+    <w:lvl w:ilvl="5" w:tplc="04090005" w:tentative="1">
+      <w:start w:val="1"/>
+      <w:numFmt w:val="bullet"/>
+      <w:lvlText w:val=""/>
+      <w:lvlJc w:val="left"/>
+      <w:pPr>
+        <w:ind w:left="4680" w:hanging="360"/>
+      </w:pPr>
+      <w:rPr>
+        <w:rFonts w:ascii="Wingdings" w:hAnsi="Wingdings" w:hint="default"/>
+      </w:rPr>
+    </w:lvl>
+    <w:lvl w:ilvl="6" w:tplc="04090001" w:tentative="1">
+      <w:start w:val="1"/>
+      <w:numFmt w:val="bullet"/>
+      <w:lvlText w:val=""/>
+      <w:lvlJc w:val="left"/>
+      <w:pPr>
+        <w:ind w:left="5400" w:hanging="360"/>
+      </w:pPr>
+      <w:rPr>
+        <w:rFonts w:ascii="Symbol" w:hAnsi="Symbol" w:hint="default"/>
+      </w:rPr>
+    </w:lvl>
+    <w:lvl w:ilvl="7" w:tplc="04090003" w:tentative="1">
+      <w:start w:val="1"/>
+      <w:numFmt w:val="bullet"/>
+      <w:lvlText w:val="o"/>
+      <w:lvlJc w:val="left"/>
+      <w:pPr>
+        <w:ind w:left="6120" w:hanging="360"/>
+      </w:pPr>
+      <w:rPr>
+        <w:rFonts w:ascii="Courier New" w:hAnsi="Courier New" w:cs="Courier New" w:hint="default"/>
+      </w:rPr>
+    </w:lvl>
+    <w:lvl w:ilvl="8" w:tplc="04090005" w:tentative="1">
+      <w:start w:val="1"/>
+      <w:numFmt w:val="bullet"/>
+      <w:lvlText w:val=""/>
+      <w:lvlJc w:val="left"/>
+      <w:pPr>
+        <w:ind w:left="6840" w:hanging="360"/>
+      </w:pPr>
+      <w:rPr>
+        <w:rFonts w:ascii="Wingdings" w:hAnsi="Wingdings" w:hint="default"/>
+      </w:rPr>
+    </w:lvl>
+  </w:abstractNum>
+  <w:abstractNum w:abstractNumId="1" w15:restartNumberingAfterBreak="0">
     <w:nsid w:val="42F87782"/>
     <w:multiLevelType w:val="hybridMultilevel"/>
     <w:tmpl w:val="841E07D0"/>
@@ -3573,7 +4925,7 @@
       </w:pPr>
     </w:lvl>
   </w:abstractNum>
-  <w:abstractNum w:abstractNumId="1" w15:restartNumberingAfterBreak="0">
+  <w:abstractNum w:abstractNumId="2" w15:restartNumberingAfterBreak="0">
     <w:nsid w:val="4CFE765C"/>
     <w:multiLevelType w:val="hybridMultilevel"/>
     <w:tmpl w:val="8D823B74"/>
@@ -3687,9 +5039,12 @@
     </w:lvl>
   </w:abstractNum>
   <w:num w:numId="1" w16cid:durableId="450710361">
+    <w:abstractNumId w:val="2"/>
+  </w:num>
+  <w:num w:numId="2" w16cid:durableId="398333865">
     <w:abstractNumId w:val="1"/>
   </w:num>
-  <w:num w:numId="2" w16cid:durableId="398333865">
+  <w:num w:numId="3" w16cid:durableId="1991130566">
     <w:abstractNumId w:val="0"/>
   </w:num>
 </w:numbering>
@@ -4095,7 +5450,7 @@
   <w:style w:type="paragraph" w:default="1" w:styleId="Normal">
     <w:name w:val="Normal"/>
     <w:qFormat/>
-    <w:rsid w:val="00393E3E"/>
+    <w:rsid w:val="005C3EEF"/>
   </w:style>
   <w:style w:type="paragraph" w:styleId="Heading1">
     <w:name w:val="heading 1"/>

</xml_diff>